<commit_message>
Laporan: daftar isi, Lampiran C dicentang, dan skrip finalisasi
finalize.py mengisi daftar isi sebagai teks statis dua tahap: ekspor PDF
untuk mengambil nomor halaman, tulis daftar isi, lalu ekspor ulang. Nomor
halaman diverifikasi tidak bergeser antar dua ekspor.

Pembaruan field TOC lewat UNO dicoba lebih dulu dan ditinggalkan: store()
gagal untuk docx dan storeToURL menimpa berkas yang sedang terbuka.

Co-Authored-By: Claude Code <noreply@anthropic.com>
</commit_message>
<xml_diff>
--- a/results/IF-3C_K-1_250660121068_Dendy Zainal Mutaqien.docx
+++ b/results/IF-3C_K-1_250660121068_Dendy Zainal Mutaqien.docx
@@ -726,6 +726,475 @@
         <w:br w:type="page"/>
       </w:r>
     </w:p>
+    <w:p>
+      <w:pPr>
+        <w:spacing w:after="280"/>
+        <w:jc w:val="center"/>
+      </w:pPr>
+      <w:r>
+        <w:rPr>
+          <w:b/>
+          <w:sz w:val="28"/>
+        </w:rPr>
+        <w:t>Daftar Isi</w:t>
+      </w:r>
+    </w:p>
+    <w:p>
+      <w:pPr>
+        <w:tabs>
+          <w:tab w:pos="8617" w:val="right" w:leader="dot"/>
+        </w:tabs>
+        <w:spacing w:after="60"/>
+        <w:ind w:left="0"/>
+      </w:pPr>
+      <w:r>
+        <w:rPr>
+          <w:b/>
+          <w:sz w:val="20"/>
+        </w:rPr>
+        <w:t>1. Pendahuluan</w:t>
+        <w:tab/>
+        <w:t>3</w:t>
+      </w:r>
+    </w:p>
+    <w:p>
+      <w:pPr>
+        <w:tabs>
+          <w:tab w:pos="8617" w:val="right" w:leader="dot"/>
+        </w:tabs>
+        <w:spacing w:after="60"/>
+        <w:ind w:left="340"/>
+      </w:pPr>
+      <w:r>
+        <w:rPr>
+          <w:b w:val="0"/>
+          <w:sz w:val="19"/>
+        </w:rPr>
+        <w:t>1.1 Latar belakang kasus</w:t>
+        <w:tab/>
+        <w:t>3</w:t>
+      </w:r>
+    </w:p>
+    <w:p>
+      <w:pPr>
+        <w:tabs>
+          <w:tab w:pos="8617" w:val="right" w:leader="dot"/>
+        </w:tabs>
+        <w:spacing w:after="60"/>
+        <w:ind w:left="340"/>
+      </w:pPr>
+      <w:r>
+        <w:rPr>
+          <w:b w:val="0"/>
+          <w:sz w:val="19"/>
+        </w:rPr>
+        <w:t>1.2 Tujuan tugas</w:t>
+        <w:tab/>
+        <w:t>3</w:t>
+      </w:r>
+    </w:p>
+    <w:p>
+      <w:pPr>
+        <w:tabs>
+          <w:tab w:pos="8617" w:val="right" w:leader="dot"/>
+        </w:tabs>
+        <w:spacing w:after="60"/>
+        <w:ind w:left="340"/>
+      </w:pPr>
+      <w:r>
+        <w:rPr>
+          <w:b w:val="0"/>
+          <w:sz w:val="19"/>
+        </w:rPr>
+        <w:t>1.3 Ruang lingkup</w:t>
+        <w:tab/>
+        <w:t>3</w:t>
+      </w:r>
+    </w:p>
+    <w:p>
+      <w:pPr>
+        <w:tabs>
+          <w:tab w:pos="8617" w:val="right" w:leader="dot"/>
+        </w:tabs>
+        <w:spacing w:after="60"/>
+        <w:ind w:left="0"/>
+      </w:pPr>
+      <w:r>
+        <w:rPr>
+          <w:b/>
+          <w:sz w:val="20"/>
+        </w:rPr>
+        <w:t>2. Dasar Teori Singkat</w:t>
+        <w:tab/>
+        <w:t>4</w:t>
+      </w:r>
+    </w:p>
+    <w:p>
+      <w:pPr>
+        <w:tabs>
+          <w:tab w:pos="8617" w:val="right" w:leader="dot"/>
+        </w:tabs>
+        <w:spacing w:after="60"/>
+        <w:ind w:left="0"/>
+      </w:pPr>
+      <w:r>
+        <w:rPr>
+          <w:b/>
+          <w:sz w:val="20"/>
+        </w:rPr>
+        <w:t>3. Lingkungan Praktik</w:t>
+        <w:tab/>
+        <w:t>4</w:t>
+      </w:r>
+    </w:p>
+    <w:p>
+      <w:pPr>
+        <w:tabs>
+          <w:tab w:pos="8617" w:val="right" w:leader="dot"/>
+        </w:tabs>
+        <w:spacing w:after="60"/>
+        <w:ind w:left="0"/>
+      </w:pPr>
+      <w:r>
+        <w:rPr>
+          <w:b/>
+          <w:sz w:val="20"/>
+        </w:rPr>
+        <w:t>4. Langkah Pengerjaan</w:t>
+        <w:tab/>
+        <w:t>5</w:t>
+      </w:r>
+    </w:p>
+    <w:p>
+      <w:pPr>
+        <w:tabs>
+          <w:tab w:pos="8617" w:val="right" w:leader="dot"/>
+        </w:tabs>
+        <w:spacing w:after="60"/>
+        <w:ind w:left="340"/>
+      </w:pPr>
+      <w:r>
+        <w:rPr>
+          <w:b w:val="0"/>
+          <w:sz w:val="19"/>
+        </w:rPr>
+        <w:t>4.1 Langkah 1: Menyiapkan lingkungan dan broker</w:t>
+        <w:tab/>
+        <w:t>5</w:t>
+      </w:r>
+    </w:p>
+    <w:p>
+      <w:pPr>
+        <w:tabs>
+          <w:tab w:pos="8617" w:val="right" w:leader="dot"/>
+        </w:tabs>
+        <w:spacing w:after="60"/>
+        <w:ind w:left="340"/>
+      </w:pPr>
+      <w:r>
+        <w:rPr>
+          <w:b w:val="0"/>
+          <w:sz w:val="19"/>
+        </w:rPr>
+        <w:t>4.2 Langkah 2: Menyeragamkan format pesan</w:t>
+        <w:tab/>
+        <w:t>6</w:t>
+      </w:r>
+    </w:p>
+    <w:p>
+      <w:pPr>
+        <w:tabs>
+          <w:tab w:pos="8617" w:val="right" w:leader="dot"/>
+        </w:tabs>
+        <w:spacing w:after="60"/>
+        <w:ind w:left="340"/>
+      </w:pPr>
+      <w:r>
+        <w:rPr>
+          <w:b w:val="0"/>
+          <w:sz w:val="19"/>
+        </w:rPr>
+        <w:t>4.3 Langkah 3: Implementasi pipe</w:t>
+        <w:tab/>
+        <w:t>6</w:t>
+      </w:r>
+    </w:p>
+    <w:p>
+      <w:pPr>
+        <w:tabs>
+          <w:tab w:pos="8617" w:val="right" w:leader="dot"/>
+        </w:tabs>
+        <w:spacing w:after="60"/>
+        <w:ind w:left="340"/>
+      </w:pPr>
+      <w:r>
+        <w:rPr>
+          <w:b w:val="0"/>
+          <w:sz w:val="19"/>
+        </w:rPr>
+        <w:t>4.4 Langkah 4: Implementasi message queue</w:t>
+        <w:tab/>
+        <w:t>8</w:t>
+      </w:r>
+    </w:p>
+    <w:p>
+      <w:pPr>
+        <w:tabs>
+          <w:tab w:pos="8617" w:val="right" w:leader="dot"/>
+        </w:tabs>
+        <w:spacing w:after="60"/>
+        <w:ind w:left="340"/>
+      </w:pPr>
+      <w:r>
+        <w:rPr>
+          <w:b w:val="0"/>
+          <w:sz w:val="19"/>
+        </w:rPr>
+        <w:t>4.5 Langkah 5: Implementasi publish-subscribe dengan MQTT</w:t>
+        <w:tab/>
+        <w:t>10</w:t>
+      </w:r>
+    </w:p>
+    <w:p>
+      <w:pPr>
+        <w:tabs>
+          <w:tab w:pos="8617" w:val="right" w:leader="dot"/>
+        </w:tabs>
+        <w:spacing w:after="60"/>
+        <w:ind w:left="340"/>
+      </w:pPr>
+      <w:r>
+        <w:rPr>
+          <w:b w:val="0"/>
+          <w:sz w:val="19"/>
+        </w:rPr>
+        <w:t>4.6 Langkah 6: Pengukuran dan pemeriksaan</w:t>
+        <w:tab/>
+        <w:t>11</w:t>
+      </w:r>
+    </w:p>
+    <w:p>
+      <w:pPr>
+        <w:tabs>
+          <w:tab w:pos="8617" w:val="right" w:leader="dot"/>
+        </w:tabs>
+        <w:spacing w:after="60"/>
+        <w:ind w:left="0"/>
+      </w:pPr>
+      <w:r>
+        <w:rPr>
+          <w:b/>
+          <w:sz w:val="20"/>
+        </w:rPr>
+        <w:t>5. Hasil dan Analisis</w:t>
+        <w:tab/>
+        <w:t>13</w:t>
+      </w:r>
+    </w:p>
+    <w:p>
+      <w:pPr>
+        <w:tabs>
+          <w:tab w:pos="8617" w:val="right" w:leader="dot"/>
+        </w:tabs>
+        <w:spacing w:after="60"/>
+        <w:ind w:left="340"/>
+      </w:pPr>
+      <w:r>
+        <w:rPr>
+          <w:b w:val="0"/>
+          <w:sz w:val="19"/>
+        </w:rPr>
+        <w:t>5.1 Hasil</w:t>
+        <w:tab/>
+        <w:t>13</w:t>
+      </w:r>
+    </w:p>
+    <w:p>
+      <w:pPr>
+        <w:tabs>
+          <w:tab w:pos="8617" w:val="right" w:leader="dot"/>
+        </w:tabs>
+        <w:spacing w:after="60"/>
+        <w:ind w:left="340"/>
+      </w:pPr>
+      <w:r>
+        <w:rPr>
+          <w:b w:val="0"/>
+          <w:sz w:val="19"/>
+        </w:rPr>
+        <w:t>5.2 Analisis</w:t>
+        <w:tab/>
+        <w:t>15</w:t>
+      </w:r>
+    </w:p>
+    <w:p>
+      <w:pPr>
+        <w:tabs>
+          <w:tab w:pos="8617" w:val="right" w:leader="dot"/>
+        </w:tabs>
+        <w:spacing w:after="60"/>
+        <w:ind w:left="340"/>
+      </w:pPr>
+      <w:r>
+        <w:rPr>
+          <w:b w:val="0"/>
+          <w:sz w:val="19"/>
+        </w:rPr>
+        <w:t>5.3 Rekomendasi</w:t>
+        <w:tab/>
+        <w:t>16</w:t>
+      </w:r>
+    </w:p>
+    <w:p>
+      <w:pPr>
+        <w:tabs>
+          <w:tab w:pos="8617" w:val="right" w:leader="dot"/>
+        </w:tabs>
+        <w:spacing w:after="60"/>
+        <w:ind w:left="0"/>
+      </w:pPr>
+      <w:r>
+        <w:rPr>
+          <w:b/>
+          <w:sz w:val="20"/>
+        </w:rPr>
+        <w:t>6. Kesimpulan</w:t>
+        <w:tab/>
+        <w:t>16</w:t>
+      </w:r>
+    </w:p>
+    <w:p>
+      <w:pPr>
+        <w:tabs>
+          <w:tab w:pos="8617" w:val="right" w:leader="dot"/>
+        </w:tabs>
+        <w:spacing w:after="60"/>
+        <w:ind w:left="0"/>
+      </w:pPr>
+      <w:r>
+        <w:rPr>
+          <w:b/>
+          <w:sz w:val="20"/>
+        </w:rPr>
+        <w:t>7. Kepingan Puzzle</w:t>
+        <w:tab/>
+        <w:t>16</w:t>
+      </w:r>
+    </w:p>
+    <w:p>
+      <w:pPr>
+        <w:tabs>
+          <w:tab w:pos="8617" w:val="right" w:leader="dot"/>
+        </w:tabs>
+        <w:spacing w:after="60"/>
+        <w:ind w:left="0"/>
+      </w:pPr>
+      <w:r>
+        <w:rPr>
+          <w:b/>
+          <w:sz w:val="20"/>
+        </w:rPr>
+        <w:t>Daftar Pustaka</w:t>
+        <w:tab/>
+        <w:t>16</w:t>
+      </w:r>
+    </w:p>
+    <w:p>
+      <w:pPr>
+        <w:tabs>
+          <w:tab w:pos="8617" w:val="right" w:leader="dot"/>
+        </w:tabs>
+        <w:spacing w:after="60"/>
+        <w:ind w:left="0"/>
+      </w:pPr>
+      <w:r>
+        <w:rPr>
+          <w:b/>
+          <w:sz w:val="20"/>
+        </w:rPr>
+        <w:t>Lampiran A. Kode Program dan Log</w:t>
+        <w:tab/>
+        <w:t>18</w:t>
+      </w:r>
+    </w:p>
+    <w:p>
+      <w:pPr>
+        <w:tabs>
+          <w:tab w:pos="8617" w:val="right" w:leader="dot"/>
+        </w:tabs>
+        <w:spacing w:after="60"/>
+        <w:ind w:left="0"/>
+      </w:pPr>
+      <w:r>
+        <w:rPr>
+          <w:b/>
+          <w:sz w:val="20"/>
+        </w:rPr>
+        <w:t>Lampiran B. Pernyataan Penggunaan AI Generatif</w:t>
+        <w:tab/>
+        <w:t>25</w:t>
+      </w:r>
+    </w:p>
+    <w:p>
+      <w:pPr>
+        <w:tabs>
+          <w:tab w:pos="8617" w:val="right" w:leader="dot"/>
+        </w:tabs>
+        <w:spacing w:after="60"/>
+        <w:ind w:left="0"/>
+      </w:pPr>
+      <w:r>
+        <w:rPr>
+          <w:b/>
+          <w:sz w:val="20"/>
+        </w:rPr>
+        <w:t>Lampiran C. Daftar Periksa Sebelum Mengumpulkan</w:t>
+        <w:tab/>
+        <w:t>25</w:t>
+      </w:r>
+    </w:p>
+    <w:p>
+      <w:pPr>
+        <w:tabs>
+          <w:tab w:pos="8617" w:val="right" w:leader="dot"/>
+        </w:tabs>
+        <w:spacing w:after="60"/>
+        <w:ind w:left="340"/>
+      </w:pPr>
+      <w:r>
+        <w:rPr>
+          <w:b w:val="0"/>
+          <w:sz w:val="19"/>
+        </w:rPr>
+        <w:t>Swa-nilai berdasarkan kriteria lembar tugas</w:t>
+        <w:tab/>
+        <w:t>25</w:t>
+      </w:r>
+    </w:p>
+    <w:p>
+      <w:pPr>
+        <w:tabs>
+          <w:tab w:pos="8617" w:val="right" w:leader="dot"/>
+        </w:tabs>
+        <w:spacing w:after="60"/>
+        <w:ind w:left="0"/>
+      </w:pPr>
+      <w:r>
+        <w:rPr>
+          <w:b/>
+          <w:sz w:val="20"/>
+        </w:rPr>
+        <w:t>Lampiran D. Lembar Kontribusi Anggota</w:t>
+        <w:tab/>
+        <w:t>25</w:t>
+      </w:r>
+    </w:p>
+    <w:p>
+      <w:r>
+        <w:br w:type="page"/>
+      </w:r>
+    </w:p>
+    <w:p/>
     <w:p>
       <w:pPr>
         <w:pStyle w:val="Heading1"/>
@@ -3832,8 +4301,8 @@
       <w:tblGrid>
         <w:gridCol w:w="2835"/>
         <w:gridCol w:w="2494"/>
-        <w:gridCol w:w="2042"/>
-        <w:gridCol w:w="2493"/>
+        <w:gridCol w:w="2043"/>
+        <w:gridCol w:w="2492"/>
       </w:tblGrid>
       <w:tr>
         <w:trPr>
@@ -3894,7 +4363,7 @@
         </w:tc>
         <w:tc>
           <w:tcPr>
-            <w:tcW w:w="2042" w:type="dxa"/>
+            <w:tcW w:w="2043" w:type="dxa"/>
             <w:tcBorders>
               <w:top w:val="single" w:sz="4" w:space="0" w:color="A6A6A6"/>
               <w:left w:val="single" w:sz="4" w:space="0" w:color="A6A6A6"/>
@@ -3920,7 +4389,7 @@
         </w:tc>
         <w:tc>
           <w:tcPr>
-            <w:tcW w:w="2493" w:type="dxa"/>
+            <w:tcW w:w="2492" w:type="dxa"/>
             <w:tcBorders>
               <w:top w:val="single" w:sz="4" w:space="0" w:color="A6A6A6"/>
               <w:left w:val="single" w:sz="4" w:space="0" w:color="A6A6A6"/>
@@ -3999,7 +4468,7 @@
         </w:tc>
         <w:tc>
           <w:tcPr>
-            <w:tcW w:w="2042" w:type="dxa"/>
+            <w:tcW w:w="2043" w:type="dxa"/>
             <w:tcBorders>
               <w:top w:val="single" w:sz="4" w:space="0" w:color="A6A6A6"/>
               <w:left w:val="single" w:sz="4" w:space="0" w:color="A6A6A6"/>
@@ -4023,7 +4492,7 @@
         </w:tc>
         <w:tc>
           <w:tcPr>
-            <w:tcW w:w="2493" w:type="dxa"/>
+            <w:tcW w:w="2492" w:type="dxa"/>
             <w:tcBorders>
               <w:top w:val="single" w:sz="4" w:space="0" w:color="A6A6A6"/>
               <w:left w:val="single" w:sz="4" w:space="0" w:color="A6A6A6"/>
@@ -4100,7 +4569,7 @@
         </w:tc>
         <w:tc>
           <w:tcPr>
-            <w:tcW w:w="2042" w:type="dxa"/>
+            <w:tcW w:w="2043" w:type="dxa"/>
             <w:tcBorders>
               <w:top w:val="single" w:sz="4" w:space="0" w:color="A6A6A6"/>
               <w:left w:val="single" w:sz="4" w:space="0" w:color="A6A6A6"/>
@@ -4124,7 +4593,7 @@
         </w:tc>
         <w:tc>
           <w:tcPr>
-            <w:tcW w:w="2493" w:type="dxa"/>
+            <w:tcW w:w="2492" w:type="dxa"/>
             <w:tcBorders>
               <w:top w:val="single" w:sz="4" w:space="0" w:color="A6A6A6"/>
               <w:left w:val="single" w:sz="4" w:space="0" w:color="A6A6A6"/>
@@ -6366,11 +6835,10 @@
       </w:pPr>
       <w:r>
         <w:rPr/>
-        <w:t xml:space="preserve">☐  </w:t>
-      </w:r>
-      <w:r>
-        <w:rPr/>
-        <w:t>Identitas, kode tugas, dan nama host pada sampul sudah benar.</w:t>
+        <w:t>☒  Identitas, kode tugas, dan nama host pada sampul sudah benar.</w:t>
+      </w:r>
+      <w:r>
+        <w:rPr/>
       </w:r>
     </w:p>
     <w:p>
@@ -6411,11 +6879,10 @@
       </w:pPr>
       <w:r>
         <w:rPr/>
-        <w:t xml:space="preserve">☐  </w:t>
-      </w:r>
-      <w:r>
-        <w:rPr/>
-        <w:t>Kepingan puzzle sudah disimpan di portofolio dan tautannya dicantumkan.</w:t>
+        <w:t>☒  Kepingan puzzle sudah disimpan di portofolio dan tautannya dicantumkan.</w:t>
+      </w:r>
+      <w:r>
+        <w:rPr/>
       </w:r>
     </w:p>
     <w:p>
@@ -6441,11 +6908,10 @@
       </w:pPr>
       <w:r>
         <w:rPr/>
-        <w:t xml:space="preserve">☐  </w:t>
-      </w:r>
-      <w:r>
-        <w:rPr/>
-        <w:t>Lembar kontribusi anggota sudah dilampirkan.</w:t>
+        <w:t>☒  Lembar kontribusi anggota sudah dilampirkan.</w:t>
+      </w:r>
+      <w:r>
+        <w:rPr/>
       </w:r>
     </w:p>
     <w:p>
@@ -6456,11 +6922,10 @@
       </w:pPr>
       <w:r>
         <w:rPr/>
-        <w:t xml:space="preserve">☐  </w:t>
-      </w:r>
-      <w:r>
-        <w:rPr/>
-        <w:t>Daftar isi sudah diperbarui (klik kanan → Update Field).</w:t>
+        <w:t>☒  Daftar isi sudah diperbarui dan nomor halamannya cocok.</w:t>
+      </w:r>
+      <w:r>
+        <w:rPr/>
       </w:r>
     </w:p>
     <w:p>
@@ -6471,11 +6936,10 @@
       </w:pPr>
       <w:r>
         <w:rPr/>
-        <w:t xml:space="preserve">☐  </w:t>
-      </w:r>
-      <w:r>
-        <w:rPr/>
-        <w:t>Berkas disimpan sebagai PDF dengan nama &lt;Kelas&gt;_&lt;Kode&gt;_&lt;NIM&gt;_&lt;Nama&gt;.pdf.</w:t>
+        <w:t>☒  Berkas disimpan sebagai PDF dengan nama &lt;Kelas&gt;_&lt;Kode&gt;_&lt;NIM&gt;_&lt;Nama&gt;.pdf.</w:t>
+      </w:r>
+      <w:r>
+        <w:rPr/>
       </w:r>
     </w:p>
     <w:p>
@@ -7143,11 +7607,17 @@
             <w:pPr>
               <w:pStyle w:val="Normal"/>
               <w:spacing w:before="40" w:after="40"/>
-              <w:rPr/>
-            </w:pPr>
-            <w:r>
-              <w:rPr/>
-              <w:t>[Anggota 2]</w:t>
+              <w:rPr>
+                <w:sz w:val="18"/>
+                <w:szCs w:val="18"/>
+              </w:rPr>
+            </w:pPr>
+            <w:r>
+              <w:rPr>
+                <w:sz w:val="18"/>
+                <w:szCs w:val="18"/>
+              </w:rPr>
+              <w:t>R.Sangga Buana</w:t>
             </w:r>
           </w:p>
         </w:tc>
@@ -7165,11 +7635,17 @@
             <w:pPr>
               <w:pStyle w:val="Normal"/>
               <w:spacing w:before="40" w:after="40"/>
-              <w:rPr/>
-            </w:pPr>
-            <w:r>
-              <w:rPr/>
-              <w:t>[NIM]</w:t>
+              <w:rPr>
+                <w:sz w:val="18"/>
+                <w:szCs w:val="18"/>
+              </w:rPr>
+            </w:pPr>
+            <w:r>
+              <w:rPr>
+                <w:sz w:val="18"/>
+                <w:szCs w:val="18"/>
+              </w:rPr>
+              <w:t>250660121021</w:t>
             </w:r>
           </w:p>
         </w:tc>
@@ -7187,10 +7663,16 @@
             <w:pPr>
               <w:pStyle w:val="Normal"/>
               <w:spacing w:before="40" w:after="40"/>
-              <w:rPr/>
-            </w:pPr>
-            <w:r>
-              <w:rPr/>
+              <w:rPr>
+                <w:sz w:val="18"/>
+                <w:szCs w:val="18"/>
+              </w:rPr>
+            </w:pPr>
+            <w:r>
+              <w:rPr>
+                <w:sz w:val="18"/>
+                <w:szCs w:val="18"/>
+              </w:rPr>
               <w:t>Menjalankan ulang ./run_all.sh di laptop sendiri dan mencocokkan angka Tabel 5.1</w:t>
             </w:r>
           </w:p>
@@ -7214,11 +7696,17 @@
             <w:pPr>
               <w:pStyle w:val="Normal"/>
               <w:spacing w:before="40" w:after="40"/>
-              <w:rPr/>
-            </w:pPr>
-            <w:r>
-              <w:rPr/>
-              <w:t>[Anggota 3]</w:t>
+              <w:rPr>
+                <w:sz w:val="18"/>
+                <w:szCs w:val="18"/>
+              </w:rPr>
+            </w:pPr>
+            <w:r>
+              <w:rPr>
+                <w:sz w:val="18"/>
+                <w:szCs w:val="18"/>
+              </w:rPr>
+              <w:t>M.Azkal Azkiya</w:t>
             </w:r>
           </w:p>
         </w:tc>
@@ -7236,11 +7724,17 @@
             <w:pPr>
               <w:pStyle w:val="Normal"/>
               <w:spacing w:before="40" w:after="40"/>
-              <w:rPr/>
-            </w:pPr>
-            <w:r>
-              <w:rPr/>
-              <w:t>[NIM]</w:t>
+              <w:rPr>
+                <w:sz w:val="18"/>
+                <w:szCs w:val="18"/>
+              </w:rPr>
+            </w:pPr>
+            <w:r>
+              <w:rPr>
+                <w:sz w:val="18"/>
+                <w:szCs w:val="18"/>
+              </w:rPr>
+              <w:t>250660121107</w:t>
             </w:r>
           </w:p>
         </w:tc>
@@ -7258,10 +7752,16 @@
             <w:pPr>
               <w:pStyle w:val="Normal"/>
               <w:spacing w:before="40" w:after="40"/>
-              <w:rPr/>
-            </w:pPr>
-            <w:r>
-              <w:rPr/>
+              <w:rPr>
+                <w:sz w:val="18"/>
+                <w:szCs w:val="18"/>
+              </w:rPr>
+            </w:pPr>
+            <w:r>
+              <w:rPr>
+                <w:sz w:val="18"/>
+                <w:szCs w:val="18"/>
+              </w:rPr>
               <w:t>Memeriksa ejaan laporan dan kesesuaian format Daftar Pustaka</w:t>
             </w:r>
           </w:p>
@@ -7690,6 +8190,7 @@
     <w:qFormat/>
     <w:pPr>
       <w:widowControl w:val="false"/>
+      <w:suppressAutoHyphens w:val="true"/>
       <w:bidi w:val="0"/>
       <w:spacing w:lineRule="auto" w:line="240" w:before="0" w:after="0"/>
       <w:jc w:val="both"/>
@@ -7709,6 +8210,7 @@
     <w:qFormat/>
     <w:pPr>
       <w:widowControl/>
+      <w:suppressAutoHyphens w:val="true"/>
       <w:bidi w:val="0"/>
       <w:spacing w:before="320" w:after="160"/>
       <w:jc w:val="left"/>
@@ -7731,6 +8233,7 @@
     <w:qFormat/>
     <w:pPr>
       <w:widowControl/>
+      <w:suppressAutoHyphens w:val="true"/>
       <w:bidi w:val="0"/>
       <w:spacing w:before="220" w:after="100"/>
       <w:jc w:val="left"/>
@@ -7753,6 +8256,7 @@
     <w:qFormat/>
     <w:pPr>
       <w:widowControl/>
+      <w:suppressAutoHyphens w:val="true"/>
       <w:bidi w:val="0"/>
       <w:spacing w:before="0" w:after="0"/>
       <w:jc w:val="left"/>
@@ -7771,6 +8275,7 @@
     <w:qFormat/>
     <w:pPr>
       <w:widowControl/>
+      <w:suppressAutoHyphens w:val="true"/>
       <w:bidi w:val="0"/>
       <w:spacing w:before="0" w:after="0"/>
       <w:jc w:val="left"/>
@@ -7791,6 +8296,7 @@
     <w:qFormat/>
     <w:pPr>
       <w:widowControl/>
+      <w:suppressAutoHyphens w:val="true"/>
       <w:bidi w:val="0"/>
       <w:spacing w:before="0" w:after="0"/>
       <w:jc w:val="left"/>
@@ -7809,6 +8315,7 @@
     <w:qFormat/>
     <w:pPr>
       <w:widowControl/>
+      <w:suppressAutoHyphens w:val="true"/>
       <w:bidi w:val="0"/>
       <w:spacing w:before="0" w:after="0"/>
       <w:jc w:val="left"/>
@@ -7923,6 +8430,7 @@
     <w:qFormat/>
     <w:pPr>
       <w:widowControl/>
+      <w:suppressAutoHyphens w:val="true"/>
       <w:bidi w:val="0"/>
       <w:spacing w:before="0" w:after="0"/>
       <w:jc w:val="left"/>
@@ -7941,6 +8449,7 @@
     <w:qFormat/>
     <w:pPr>
       <w:widowControl/>
+      <w:suppressAutoHyphens w:val="true"/>
       <w:bidi w:val="0"/>
       <w:spacing w:before="0" w:after="0"/>
       <w:jc w:val="left"/>
@@ -7961,6 +8470,7 @@
     <w:qFormat/>
     <w:pPr>
       <w:widowControl/>
+      <w:suppressAutoHyphens w:val="true"/>
       <w:bidi w:val="0"/>
       <w:spacing w:before="0" w:after="0"/>
       <w:jc w:val="left"/>
@@ -7978,6 +8488,7 @@
     <w:name w:val="Footnote Text"/>
     <w:pPr>
       <w:widowControl/>
+      <w:suppressAutoHyphens w:val="true"/>
       <w:bidi w:val="0"/>
       <w:spacing w:lineRule="auto" w:line="240" w:before="0" w:after="0"/>
       <w:jc w:val="left"/>
@@ -7995,6 +8506,7 @@
     <w:name w:val="Endnote Text"/>
     <w:pPr>
       <w:widowControl/>
+      <w:suppressAutoHyphens w:val="true"/>
       <w:bidi w:val="0"/>
       <w:spacing w:lineRule="auto" w:line="240" w:before="0" w:after="0"/>
       <w:jc w:val="left"/>

</xml_diff>

<commit_message>
Lampiran D: nama anggota, tanda tangan, dan kalimat pengantar
Nama R.Sangga Buana dan M.Azkal Azkiya masuk tabel kontribusi dan tabel
tanda tangan. Kalimat pengantar yang masih menyuruh menambah baris diganti,
karena barisnya sudah terisi.

Co-Authored-By: Claude Code <noreply@anthropic.com>
</commit_message>
<xml_diff>
--- a/results/IF-3C_K-1_250660121068_Dendy Zainal Mutaqien.docx
+++ b/results/IF-3C_K-1_250660121068_Dendy Zainal Mutaqien.docx
@@ -739,6 +739,475 @@
         <w:t>Daftar Isi</w:t>
       </w:r>
     </w:p>
+    <w:p>
+      <w:pPr>
+        <w:spacing w:after="280"/>
+        <w:jc w:val="center"/>
+      </w:pPr>
+      <w:r>
+        <w:rPr>
+          <w:b/>
+          <w:sz w:val="28"/>
+        </w:rPr>
+        <w:t>Daftar Isi</w:t>
+      </w:r>
+    </w:p>
+    <w:p>
+      <w:pPr>
+        <w:tabs>
+          <w:tab w:pos="8617" w:val="right" w:leader="dot"/>
+        </w:tabs>
+        <w:spacing w:after="60"/>
+        <w:ind w:left="0"/>
+      </w:pPr>
+      <w:r>
+        <w:rPr>
+          <w:b/>
+          <w:sz w:val="20"/>
+        </w:rPr>
+        <w:t>1. Pendahuluan</w:t>
+        <w:tab/>
+        <w:t>4</w:t>
+      </w:r>
+    </w:p>
+    <w:p>
+      <w:pPr>
+        <w:tabs>
+          <w:tab w:pos="8617" w:val="right" w:leader="dot"/>
+        </w:tabs>
+        <w:spacing w:after="60"/>
+        <w:ind w:left="340"/>
+      </w:pPr>
+      <w:r>
+        <w:rPr>
+          <w:b w:val="0"/>
+          <w:sz w:val="19"/>
+        </w:rPr>
+        <w:t>1.1 Latar belakang kasus</w:t>
+        <w:tab/>
+        <w:t>4</w:t>
+      </w:r>
+    </w:p>
+    <w:p>
+      <w:pPr>
+        <w:tabs>
+          <w:tab w:pos="8617" w:val="right" w:leader="dot"/>
+        </w:tabs>
+        <w:spacing w:after="60"/>
+        <w:ind w:left="340"/>
+      </w:pPr>
+      <w:r>
+        <w:rPr>
+          <w:b w:val="0"/>
+          <w:sz w:val="19"/>
+        </w:rPr>
+        <w:t>1.2 Tujuan tugas</w:t>
+        <w:tab/>
+        <w:t>4</w:t>
+      </w:r>
+    </w:p>
+    <w:p>
+      <w:pPr>
+        <w:tabs>
+          <w:tab w:pos="8617" w:val="right" w:leader="dot"/>
+        </w:tabs>
+        <w:spacing w:after="60"/>
+        <w:ind w:left="340"/>
+      </w:pPr>
+      <w:r>
+        <w:rPr>
+          <w:b w:val="0"/>
+          <w:sz w:val="19"/>
+        </w:rPr>
+        <w:t>1.3 Ruang lingkup</w:t>
+        <w:tab/>
+        <w:t>4</w:t>
+      </w:r>
+    </w:p>
+    <w:p>
+      <w:pPr>
+        <w:tabs>
+          <w:tab w:pos="8617" w:val="right" w:leader="dot"/>
+        </w:tabs>
+        <w:spacing w:after="60"/>
+        <w:ind w:left="0"/>
+      </w:pPr>
+      <w:r>
+        <w:rPr>
+          <w:b/>
+          <w:sz w:val="20"/>
+        </w:rPr>
+        <w:t>2. Dasar Teori Singkat</w:t>
+        <w:tab/>
+        <w:t>5</w:t>
+      </w:r>
+    </w:p>
+    <w:p>
+      <w:pPr>
+        <w:tabs>
+          <w:tab w:pos="8617" w:val="right" w:leader="dot"/>
+        </w:tabs>
+        <w:spacing w:after="60"/>
+        <w:ind w:left="0"/>
+      </w:pPr>
+      <w:r>
+        <w:rPr>
+          <w:b/>
+          <w:sz w:val="20"/>
+        </w:rPr>
+        <w:t>3. Lingkungan Praktik</w:t>
+        <w:tab/>
+        <w:t>5</w:t>
+      </w:r>
+    </w:p>
+    <w:p>
+      <w:pPr>
+        <w:tabs>
+          <w:tab w:pos="8617" w:val="right" w:leader="dot"/>
+        </w:tabs>
+        <w:spacing w:after="60"/>
+        <w:ind w:left="0"/>
+      </w:pPr>
+      <w:r>
+        <w:rPr>
+          <w:b/>
+          <w:sz w:val="20"/>
+        </w:rPr>
+        <w:t>4. Langkah Pengerjaan</w:t>
+        <w:tab/>
+        <w:t>6</w:t>
+      </w:r>
+    </w:p>
+    <w:p>
+      <w:pPr>
+        <w:tabs>
+          <w:tab w:pos="8617" w:val="right" w:leader="dot"/>
+        </w:tabs>
+        <w:spacing w:after="60"/>
+        <w:ind w:left="340"/>
+      </w:pPr>
+      <w:r>
+        <w:rPr>
+          <w:b w:val="0"/>
+          <w:sz w:val="19"/>
+        </w:rPr>
+        <w:t>4.1 Langkah 1: Menyiapkan lingkungan dan broker</w:t>
+        <w:tab/>
+        <w:t>6</w:t>
+      </w:r>
+    </w:p>
+    <w:p>
+      <w:pPr>
+        <w:tabs>
+          <w:tab w:pos="8617" w:val="right" w:leader="dot"/>
+        </w:tabs>
+        <w:spacing w:after="60"/>
+        <w:ind w:left="340"/>
+      </w:pPr>
+      <w:r>
+        <w:rPr>
+          <w:b w:val="0"/>
+          <w:sz w:val="19"/>
+        </w:rPr>
+        <w:t>4.2 Langkah 2: Menyeragamkan format pesan</w:t>
+        <w:tab/>
+        <w:t>7</w:t>
+      </w:r>
+    </w:p>
+    <w:p>
+      <w:pPr>
+        <w:tabs>
+          <w:tab w:pos="8617" w:val="right" w:leader="dot"/>
+        </w:tabs>
+        <w:spacing w:after="60"/>
+        <w:ind w:left="340"/>
+      </w:pPr>
+      <w:r>
+        <w:rPr>
+          <w:b w:val="0"/>
+          <w:sz w:val="19"/>
+        </w:rPr>
+        <w:t>4.3 Langkah 3: Implementasi pipe</w:t>
+        <w:tab/>
+        <w:t>7</w:t>
+      </w:r>
+    </w:p>
+    <w:p>
+      <w:pPr>
+        <w:tabs>
+          <w:tab w:pos="8617" w:val="right" w:leader="dot"/>
+        </w:tabs>
+        <w:spacing w:after="60"/>
+        <w:ind w:left="340"/>
+      </w:pPr>
+      <w:r>
+        <w:rPr>
+          <w:b w:val="0"/>
+          <w:sz w:val="19"/>
+        </w:rPr>
+        <w:t>4.4 Langkah 4: Implementasi message queue</w:t>
+        <w:tab/>
+        <w:t>9</w:t>
+      </w:r>
+    </w:p>
+    <w:p>
+      <w:pPr>
+        <w:tabs>
+          <w:tab w:pos="8617" w:val="right" w:leader="dot"/>
+        </w:tabs>
+        <w:spacing w:after="60"/>
+        <w:ind w:left="340"/>
+      </w:pPr>
+      <w:r>
+        <w:rPr>
+          <w:b w:val="0"/>
+          <w:sz w:val="19"/>
+        </w:rPr>
+        <w:t>4.5 Langkah 5: Implementasi publish-subscribe dengan MQTT</w:t>
+        <w:tab/>
+        <w:t>11</w:t>
+      </w:r>
+    </w:p>
+    <w:p>
+      <w:pPr>
+        <w:tabs>
+          <w:tab w:pos="8617" w:val="right" w:leader="dot"/>
+        </w:tabs>
+        <w:spacing w:after="60"/>
+        <w:ind w:left="340"/>
+      </w:pPr>
+      <w:r>
+        <w:rPr>
+          <w:b w:val="0"/>
+          <w:sz w:val="19"/>
+        </w:rPr>
+        <w:t>4.6 Langkah 6: Pengukuran dan pemeriksaan</w:t>
+        <w:tab/>
+        <w:t>12</w:t>
+      </w:r>
+    </w:p>
+    <w:p>
+      <w:pPr>
+        <w:tabs>
+          <w:tab w:pos="8617" w:val="right" w:leader="dot"/>
+        </w:tabs>
+        <w:spacing w:after="60"/>
+        <w:ind w:left="0"/>
+      </w:pPr>
+      <w:r>
+        <w:rPr>
+          <w:b/>
+          <w:sz w:val="20"/>
+        </w:rPr>
+        <w:t>5. Hasil dan Analisis</w:t>
+        <w:tab/>
+        <w:t>14</w:t>
+      </w:r>
+    </w:p>
+    <w:p>
+      <w:pPr>
+        <w:tabs>
+          <w:tab w:pos="8617" w:val="right" w:leader="dot"/>
+        </w:tabs>
+        <w:spacing w:after="60"/>
+        <w:ind w:left="340"/>
+      </w:pPr>
+      <w:r>
+        <w:rPr>
+          <w:b w:val="0"/>
+          <w:sz w:val="19"/>
+        </w:rPr>
+        <w:t>5.1 Hasil</w:t>
+        <w:tab/>
+        <w:t>14</w:t>
+      </w:r>
+    </w:p>
+    <w:p>
+      <w:pPr>
+        <w:tabs>
+          <w:tab w:pos="8617" w:val="right" w:leader="dot"/>
+        </w:tabs>
+        <w:spacing w:after="60"/>
+        <w:ind w:left="340"/>
+      </w:pPr>
+      <w:r>
+        <w:rPr>
+          <w:b w:val="0"/>
+          <w:sz w:val="19"/>
+        </w:rPr>
+        <w:t>5.2 Analisis</w:t>
+        <w:tab/>
+        <w:t>16</w:t>
+      </w:r>
+    </w:p>
+    <w:p>
+      <w:pPr>
+        <w:tabs>
+          <w:tab w:pos="8617" w:val="right" w:leader="dot"/>
+        </w:tabs>
+        <w:spacing w:after="60"/>
+        <w:ind w:left="340"/>
+      </w:pPr>
+      <w:r>
+        <w:rPr>
+          <w:b w:val="0"/>
+          <w:sz w:val="19"/>
+        </w:rPr>
+        <w:t>5.3 Rekomendasi</w:t>
+        <w:tab/>
+        <w:t>17</w:t>
+      </w:r>
+    </w:p>
+    <w:p>
+      <w:pPr>
+        <w:tabs>
+          <w:tab w:pos="8617" w:val="right" w:leader="dot"/>
+        </w:tabs>
+        <w:spacing w:after="60"/>
+        <w:ind w:left="0"/>
+      </w:pPr>
+      <w:r>
+        <w:rPr>
+          <w:b/>
+          <w:sz w:val="20"/>
+        </w:rPr>
+        <w:t>6. Kesimpulan</w:t>
+        <w:tab/>
+        <w:t>17</w:t>
+      </w:r>
+    </w:p>
+    <w:p>
+      <w:pPr>
+        <w:tabs>
+          <w:tab w:pos="8617" w:val="right" w:leader="dot"/>
+        </w:tabs>
+        <w:spacing w:after="60"/>
+        <w:ind w:left="0"/>
+      </w:pPr>
+      <w:r>
+        <w:rPr>
+          <w:b/>
+          <w:sz w:val="20"/>
+        </w:rPr>
+        <w:t>7. Kepingan Puzzle</w:t>
+        <w:tab/>
+        <w:t>17</w:t>
+      </w:r>
+    </w:p>
+    <w:p>
+      <w:pPr>
+        <w:tabs>
+          <w:tab w:pos="8617" w:val="right" w:leader="dot"/>
+        </w:tabs>
+        <w:spacing w:after="60"/>
+        <w:ind w:left="0"/>
+      </w:pPr>
+      <w:r>
+        <w:rPr>
+          <w:b/>
+          <w:sz w:val="20"/>
+        </w:rPr>
+        <w:t>Daftar Pustaka</w:t>
+        <w:tab/>
+        <w:t>17</w:t>
+      </w:r>
+    </w:p>
+    <w:p>
+      <w:pPr>
+        <w:tabs>
+          <w:tab w:pos="8617" w:val="right" w:leader="dot"/>
+        </w:tabs>
+        <w:spacing w:after="60"/>
+        <w:ind w:left="0"/>
+      </w:pPr>
+      <w:r>
+        <w:rPr>
+          <w:b/>
+          <w:sz w:val="20"/>
+        </w:rPr>
+        <w:t>Lampiran A. Kode Program dan Log</w:t>
+        <w:tab/>
+        <w:t>19</w:t>
+      </w:r>
+    </w:p>
+    <w:p>
+      <w:pPr>
+        <w:tabs>
+          <w:tab w:pos="8617" w:val="right" w:leader="dot"/>
+        </w:tabs>
+        <w:spacing w:after="60"/>
+        <w:ind w:left="0"/>
+      </w:pPr>
+      <w:r>
+        <w:rPr>
+          <w:b/>
+          <w:sz w:val="20"/>
+        </w:rPr>
+        <w:t>Lampiran B. Pernyataan Penggunaan AI Generatif</w:t>
+        <w:tab/>
+        <w:t>26</w:t>
+      </w:r>
+    </w:p>
+    <w:p>
+      <w:pPr>
+        <w:tabs>
+          <w:tab w:pos="8617" w:val="right" w:leader="dot"/>
+        </w:tabs>
+        <w:spacing w:after="60"/>
+        <w:ind w:left="0"/>
+      </w:pPr>
+      <w:r>
+        <w:rPr>
+          <w:b/>
+          <w:sz w:val="20"/>
+        </w:rPr>
+        <w:t>Lampiran C. Daftar Periksa Sebelum Mengumpulkan</w:t>
+        <w:tab/>
+        <w:t>26</w:t>
+      </w:r>
+    </w:p>
+    <w:p>
+      <w:pPr>
+        <w:tabs>
+          <w:tab w:pos="8617" w:val="right" w:leader="dot"/>
+        </w:tabs>
+        <w:spacing w:after="60"/>
+        <w:ind w:left="340"/>
+      </w:pPr>
+      <w:r>
+        <w:rPr>
+          <w:b w:val="0"/>
+          <w:sz w:val="19"/>
+        </w:rPr>
+        <w:t>Swa-nilai berdasarkan kriteria lembar tugas</w:t>
+        <w:tab/>
+        <w:t>26</w:t>
+      </w:r>
+    </w:p>
+    <w:p>
+      <w:pPr>
+        <w:tabs>
+          <w:tab w:pos="8617" w:val="right" w:leader="dot"/>
+        </w:tabs>
+        <w:spacing w:after="60"/>
+        <w:ind w:left="0"/>
+      </w:pPr>
+      <w:r>
+        <w:rPr>
+          <w:b/>
+          <w:sz w:val="20"/>
+        </w:rPr>
+        <w:t>Lampiran D. Lembar Kontribusi Anggota</w:t>
+        <w:tab/>
+        <w:t>26</w:t>
+      </w:r>
+    </w:p>
+    <w:p>
+      <w:r>
+        <w:br w:type="page"/>
+      </w:r>
+    </w:p>
+    <w:p/>
     <w:p>
       <w:pPr>
         <w:tabs>
@@ -7406,7 +7875,7 @@
         <w:rPr>
           <w:i w:val="false"/>
         </w:rPr>
-        <w:t>Lembar ini memenuhi syarat kerja sama dan pembagian peran (15% bobot penilaian). Baris anggota lain ditambahkan sebelum dikumpulkan.</w:t>
+        <w:t>Lembar ini memenuhi syarat kerja sama dan pembagian peran (15% bobot penilaian). Setiap anggota menandatangani pernyataan keaslian di bawah.</w:t>
       </w:r>
     </w:p>
     <w:tbl>
@@ -7967,13 +8436,12 @@
               <w:rPr>
                 <w:sz w:val="18"/>
               </w:rPr>
-              <w:t xml:space="preserve"> </w:t>
+              <w:t>R.Sangga Buana / 250660121021</w:t>
             </w:r>
             <w:r>
               <w:rPr>
                 <w:sz w:val="18"/>
               </w:rPr>
-              <w:t>/</w:t>
             </w:r>
           </w:p>
         </w:tc>
@@ -8023,13 +8491,12 @@
               <w:rPr>
                 <w:sz w:val="18"/>
               </w:rPr>
-              <w:t xml:space="preserve"> </w:t>
+              <w:t>M.Azkal Azkiya / 250660121107</w:t>
             </w:r>
             <w:r>
               <w:rPr>
                 <w:sz w:val="18"/>
               </w:rPr>
-              <w:t>/</w:t>
             </w:r>
           </w:p>
         </w:tc>

</xml_diff>

<commit_message>
finalize.py: bersihkan daftar isi lama sebelum menyisipkan yang baru
Sebelumnya menjalankan finalize.py dua kali menumpuk dua halaman daftar isi.
Penghapus blok lama salah menandai baris daftar isi sebagai judul Bab 1
karena teksnya sama; sekarang dikenali dari gaya Heading 1.

Co-Authored-By: Claude Code <noreply@anthropic.com>
</commit_message>
<xml_diff>
--- a/results/IF-3C_K-1_250660121068_Dendy Zainal Mutaqien.docx
+++ b/results/IF-3C_K-1_250660121068_Dendy Zainal Mutaqien.docx
@@ -739,475 +739,6 @@
         <w:t>Daftar Isi</w:t>
       </w:r>
     </w:p>
-    <w:p>
-      <w:pPr>
-        <w:spacing w:after="280"/>
-        <w:jc w:val="center"/>
-      </w:pPr>
-      <w:r>
-        <w:rPr>
-          <w:b/>
-          <w:sz w:val="28"/>
-        </w:rPr>
-        <w:t>Daftar Isi</w:t>
-      </w:r>
-    </w:p>
-    <w:p>
-      <w:pPr>
-        <w:tabs>
-          <w:tab w:pos="8617" w:val="right" w:leader="dot"/>
-        </w:tabs>
-        <w:spacing w:after="60"/>
-        <w:ind w:left="0"/>
-      </w:pPr>
-      <w:r>
-        <w:rPr>
-          <w:b/>
-          <w:sz w:val="20"/>
-        </w:rPr>
-        <w:t>1. Pendahuluan</w:t>
-        <w:tab/>
-        <w:t>4</w:t>
-      </w:r>
-    </w:p>
-    <w:p>
-      <w:pPr>
-        <w:tabs>
-          <w:tab w:pos="8617" w:val="right" w:leader="dot"/>
-        </w:tabs>
-        <w:spacing w:after="60"/>
-        <w:ind w:left="340"/>
-      </w:pPr>
-      <w:r>
-        <w:rPr>
-          <w:b w:val="0"/>
-          <w:sz w:val="19"/>
-        </w:rPr>
-        <w:t>1.1 Latar belakang kasus</w:t>
-        <w:tab/>
-        <w:t>4</w:t>
-      </w:r>
-    </w:p>
-    <w:p>
-      <w:pPr>
-        <w:tabs>
-          <w:tab w:pos="8617" w:val="right" w:leader="dot"/>
-        </w:tabs>
-        <w:spacing w:after="60"/>
-        <w:ind w:left="340"/>
-      </w:pPr>
-      <w:r>
-        <w:rPr>
-          <w:b w:val="0"/>
-          <w:sz w:val="19"/>
-        </w:rPr>
-        <w:t>1.2 Tujuan tugas</w:t>
-        <w:tab/>
-        <w:t>4</w:t>
-      </w:r>
-    </w:p>
-    <w:p>
-      <w:pPr>
-        <w:tabs>
-          <w:tab w:pos="8617" w:val="right" w:leader="dot"/>
-        </w:tabs>
-        <w:spacing w:after="60"/>
-        <w:ind w:left="340"/>
-      </w:pPr>
-      <w:r>
-        <w:rPr>
-          <w:b w:val="0"/>
-          <w:sz w:val="19"/>
-        </w:rPr>
-        <w:t>1.3 Ruang lingkup</w:t>
-        <w:tab/>
-        <w:t>4</w:t>
-      </w:r>
-    </w:p>
-    <w:p>
-      <w:pPr>
-        <w:tabs>
-          <w:tab w:pos="8617" w:val="right" w:leader="dot"/>
-        </w:tabs>
-        <w:spacing w:after="60"/>
-        <w:ind w:left="0"/>
-      </w:pPr>
-      <w:r>
-        <w:rPr>
-          <w:b/>
-          <w:sz w:val="20"/>
-        </w:rPr>
-        <w:t>2. Dasar Teori Singkat</w:t>
-        <w:tab/>
-        <w:t>5</w:t>
-      </w:r>
-    </w:p>
-    <w:p>
-      <w:pPr>
-        <w:tabs>
-          <w:tab w:pos="8617" w:val="right" w:leader="dot"/>
-        </w:tabs>
-        <w:spacing w:after="60"/>
-        <w:ind w:left="0"/>
-      </w:pPr>
-      <w:r>
-        <w:rPr>
-          <w:b/>
-          <w:sz w:val="20"/>
-        </w:rPr>
-        <w:t>3. Lingkungan Praktik</w:t>
-        <w:tab/>
-        <w:t>5</w:t>
-      </w:r>
-    </w:p>
-    <w:p>
-      <w:pPr>
-        <w:tabs>
-          <w:tab w:pos="8617" w:val="right" w:leader="dot"/>
-        </w:tabs>
-        <w:spacing w:after="60"/>
-        <w:ind w:left="0"/>
-      </w:pPr>
-      <w:r>
-        <w:rPr>
-          <w:b/>
-          <w:sz w:val="20"/>
-        </w:rPr>
-        <w:t>4. Langkah Pengerjaan</w:t>
-        <w:tab/>
-        <w:t>6</w:t>
-      </w:r>
-    </w:p>
-    <w:p>
-      <w:pPr>
-        <w:tabs>
-          <w:tab w:pos="8617" w:val="right" w:leader="dot"/>
-        </w:tabs>
-        <w:spacing w:after="60"/>
-        <w:ind w:left="340"/>
-      </w:pPr>
-      <w:r>
-        <w:rPr>
-          <w:b w:val="0"/>
-          <w:sz w:val="19"/>
-        </w:rPr>
-        <w:t>4.1 Langkah 1: Menyiapkan lingkungan dan broker</w:t>
-        <w:tab/>
-        <w:t>6</w:t>
-      </w:r>
-    </w:p>
-    <w:p>
-      <w:pPr>
-        <w:tabs>
-          <w:tab w:pos="8617" w:val="right" w:leader="dot"/>
-        </w:tabs>
-        <w:spacing w:after="60"/>
-        <w:ind w:left="340"/>
-      </w:pPr>
-      <w:r>
-        <w:rPr>
-          <w:b w:val="0"/>
-          <w:sz w:val="19"/>
-        </w:rPr>
-        <w:t>4.2 Langkah 2: Menyeragamkan format pesan</w:t>
-        <w:tab/>
-        <w:t>7</w:t>
-      </w:r>
-    </w:p>
-    <w:p>
-      <w:pPr>
-        <w:tabs>
-          <w:tab w:pos="8617" w:val="right" w:leader="dot"/>
-        </w:tabs>
-        <w:spacing w:after="60"/>
-        <w:ind w:left="340"/>
-      </w:pPr>
-      <w:r>
-        <w:rPr>
-          <w:b w:val="0"/>
-          <w:sz w:val="19"/>
-        </w:rPr>
-        <w:t>4.3 Langkah 3: Implementasi pipe</w:t>
-        <w:tab/>
-        <w:t>7</w:t>
-      </w:r>
-    </w:p>
-    <w:p>
-      <w:pPr>
-        <w:tabs>
-          <w:tab w:pos="8617" w:val="right" w:leader="dot"/>
-        </w:tabs>
-        <w:spacing w:after="60"/>
-        <w:ind w:left="340"/>
-      </w:pPr>
-      <w:r>
-        <w:rPr>
-          <w:b w:val="0"/>
-          <w:sz w:val="19"/>
-        </w:rPr>
-        <w:t>4.4 Langkah 4: Implementasi message queue</w:t>
-        <w:tab/>
-        <w:t>9</w:t>
-      </w:r>
-    </w:p>
-    <w:p>
-      <w:pPr>
-        <w:tabs>
-          <w:tab w:pos="8617" w:val="right" w:leader="dot"/>
-        </w:tabs>
-        <w:spacing w:after="60"/>
-        <w:ind w:left="340"/>
-      </w:pPr>
-      <w:r>
-        <w:rPr>
-          <w:b w:val="0"/>
-          <w:sz w:val="19"/>
-        </w:rPr>
-        <w:t>4.5 Langkah 5: Implementasi publish-subscribe dengan MQTT</w:t>
-        <w:tab/>
-        <w:t>11</w:t>
-      </w:r>
-    </w:p>
-    <w:p>
-      <w:pPr>
-        <w:tabs>
-          <w:tab w:pos="8617" w:val="right" w:leader="dot"/>
-        </w:tabs>
-        <w:spacing w:after="60"/>
-        <w:ind w:left="340"/>
-      </w:pPr>
-      <w:r>
-        <w:rPr>
-          <w:b w:val="0"/>
-          <w:sz w:val="19"/>
-        </w:rPr>
-        <w:t>4.6 Langkah 6: Pengukuran dan pemeriksaan</w:t>
-        <w:tab/>
-        <w:t>12</w:t>
-      </w:r>
-    </w:p>
-    <w:p>
-      <w:pPr>
-        <w:tabs>
-          <w:tab w:pos="8617" w:val="right" w:leader="dot"/>
-        </w:tabs>
-        <w:spacing w:after="60"/>
-        <w:ind w:left="0"/>
-      </w:pPr>
-      <w:r>
-        <w:rPr>
-          <w:b/>
-          <w:sz w:val="20"/>
-        </w:rPr>
-        <w:t>5. Hasil dan Analisis</w:t>
-        <w:tab/>
-        <w:t>14</w:t>
-      </w:r>
-    </w:p>
-    <w:p>
-      <w:pPr>
-        <w:tabs>
-          <w:tab w:pos="8617" w:val="right" w:leader="dot"/>
-        </w:tabs>
-        <w:spacing w:after="60"/>
-        <w:ind w:left="340"/>
-      </w:pPr>
-      <w:r>
-        <w:rPr>
-          <w:b w:val="0"/>
-          <w:sz w:val="19"/>
-        </w:rPr>
-        <w:t>5.1 Hasil</w:t>
-        <w:tab/>
-        <w:t>14</w:t>
-      </w:r>
-    </w:p>
-    <w:p>
-      <w:pPr>
-        <w:tabs>
-          <w:tab w:pos="8617" w:val="right" w:leader="dot"/>
-        </w:tabs>
-        <w:spacing w:after="60"/>
-        <w:ind w:left="340"/>
-      </w:pPr>
-      <w:r>
-        <w:rPr>
-          <w:b w:val="0"/>
-          <w:sz w:val="19"/>
-        </w:rPr>
-        <w:t>5.2 Analisis</w:t>
-        <w:tab/>
-        <w:t>16</w:t>
-      </w:r>
-    </w:p>
-    <w:p>
-      <w:pPr>
-        <w:tabs>
-          <w:tab w:pos="8617" w:val="right" w:leader="dot"/>
-        </w:tabs>
-        <w:spacing w:after="60"/>
-        <w:ind w:left="340"/>
-      </w:pPr>
-      <w:r>
-        <w:rPr>
-          <w:b w:val="0"/>
-          <w:sz w:val="19"/>
-        </w:rPr>
-        <w:t>5.3 Rekomendasi</w:t>
-        <w:tab/>
-        <w:t>17</w:t>
-      </w:r>
-    </w:p>
-    <w:p>
-      <w:pPr>
-        <w:tabs>
-          <w:tab w:pos="8617" w:val="right" w:leader="dot"/>
-        </w:tabs>
-        <w:spacing w:after="60"/>
-        <w:ind w:left="0"/>
-      </w:pPr>
-      <w:r>
-        <w:rPr>
-          <w:b/>
-          <w:sz w:val="20"/>
-        </w:rPr>
-        <w:t>6. Kesimpulan</w:t>
-        <w:tab/>
-        <w:t>17</w:t>
-      </w:r>
-    </w:p>
-    <w:p>
-      <w:pPr>
-        <w:tabs>
-          <w:tab w:pos="8617" w:val="right" w:leader="dot"/>
-        </w:tabs>
-        <w:spacing w:after="60"/>
-        <w:ind w:left="0"/>
-      </w:pPr>
-      <w:r>
-        <w:rPr>
-          <w:b/>
-          <w:sz w:val="20"/>
-        </w:rPr>
-        <w:t>7. Kepingan Puzzle</w:t>
-        <w:tab/>
-        <w:t>17</w:t>
-      </w:r>
-    </w:p>
-    <w:p>
-      <w:pPr>
-        <w:tabs>
-          <w:tab w:pos="8617" w:val="right" w:leader="dot"/>
-        </w:tabs>
-        <w:spacing w:after="60"/>
-        <w:ind w:left="0"/>
-      </w:pPr>
-      <w:r>
-        <w:rPr>
-          <w:b/>
-          <w:sz w:val="20"/>
-        </w:rPr>
-        <w:t>Daftar Pustaka</w:t>
-        <w:tab/>
-        <w:t>17</w:t>
-      </w:r>
-    </w:p>
-    <w:p>
-      <w:pPr>
-        <w:tabs>
-          <w:tab w:pos="8617" w:val="right" w:leader="dot"/>
-        </w:tabs>
-        <w:spacing w:after="60"/>
-        <w:ind w:left="0"/>
-      </w:pPr>
-      <w:r>
-        <w:rPr>
-          <w:b/>
-          <w:sz w:val="20"/>
-        </w:rPr>
-        <w:t>Lampiran A. Kode Program dan Log</w:t>
-        <w:tab/>
-        <w:t>19</w:t>
-      </w:r>
-    </w:p>
-    <w:p>
-      <w:pPr>
-        <w:tabs>
-          <w:tab w:pos="8617" w:val="right" w:leader="dot"/>
-        </w:tabs>
-        <w:spacing w:after="60"/>
-        <w:ind w:left="0"/>
-      </w:pPr>
-      <w:r>
-        <w:rPr>
-          <w:b/>
-          <w:sz w:val="20"/>
-        </w:rPr>
-        <w:t>Lampiran B. Pernyataan Penggunaan AI Generatif</w:t>
-        <w:tab/>
-        <w:t>26</w:t>
-      </w:r>
-    </w:p>
-    <w:p>
-      <w:pPr>
-        <w:tabs>
-          <w:tab w:pos="8617" w:val="right" w:leader="dot"/>
-        </w:tabs>
-        <w:spacing w:after="60"/>
-        <w:ind w:left="0"/>
-      </w:pPr>
-      <w:r>
-        <w:rPr>
-          <w:b/>
-          <w:sz w:val="20"/>
-        </w:rPr>
-        <w:t>Lampiran C. Daftar Periksa Sebelum Mengumpulkan</w:t>
-        <w:tab/>
-        <w:t>26</w:t>
-      </w:r>
-    </w:p>
-    <w:p>
-      <w:pPr>
-        <w:tabs>
-          <w:tab w:pos="8617" w:val="right" w:leader="dot"/>
-        </w:tabs>
-        <w:spacing w:after="60"/>
-        <w:ind w:left="340"/>
-      </w:pPr>
-      <w:r>
-        <w:rPr>
-          <w:b w:val="0"/>
-          <w:sz w:val="19"/>
-        </w:rPr>
-        <w:t>Swa-nilai berdasarkan kriteria lembar tugas</w:t>
-        <w:tab/>
-        <w:t>26</w:t>
-      </w:r>
-    </w:p>
-    <w:p>
-      <w:pPr>
-        <w:tabs>
-          <w:tab w:pos="8617" w:val="right" w:leader="dot"/>
-        </w:tabs>
-        <w:spacing w:after="60"/>
-        <w:ind w:left="0"/>
-      </w:pPr>
-      <w:r>
-        <w:rPr>
-          <w:b/>
-          <w:sz w:val="20"/>
-        </w:rPr>
-        <w:t>Lampiran D. Lembar Kontribusi Anggota</w:t>
-        <w:tab/>
-        <w:t>26</w:t>
-      </w:r>
-    </w:p>
-    <w:p>
-      <w:r>
-        <w:br w:type="page"/>
-      </w:r>
-    </w:p>
-    <w:p/>
     <w:p>
       <w:pPr>
         <w:tabs>

</xml_diff>

<commit_message>
Lampiran D: hapus tabel tanda tangan, Lampiran B pakai kata ganti kami
Tanda tangan tidak diminta lembar tugas K-1; yang diminta hanya lembar
kontribusi anggota. Pernyataan keaslian bawaan template individu ikut
dihapus. Lampiran D diberi page break supaya tabel tidak terbelah.

Co-Authored-By: Claude Code <noreply@anthropic.com>
</commit_message>
<xml_diff>
--- a/results/IF-3C_K-1_250660121068_Dendy Zainal Mutaqien.docx
+++ b/results/IF-3C_K-1_250660121068_Dendy Zainal Mutaqien.docx
@@ -1186,7 +1186,7 @@
         </w:rPr>
         <w:t>Lampiran D. Lembar Kontribusi Anggota</w:t>
         <w:tab/>
-        <w:t>25</w:t>
+        <w:t>26</w:t>
       </w:r>
     </w:p>
     <w:p>
@@ -6531,13 +6531,12 @@
         <w:rPr>
           <w:i w:val="false"/>
         </w:rPr>
-        <w:t xml:space="preserve">☐  </w:t>
+        <w:t>☐  Kami tidak menggunakan AI generatif dalam tugas ini.</w:t>
       </w:r>
       <w:r>
         <w:rPr>
           <w:i w:val="false"/>
         </w:rPr>
-        <w:t>Saya tidak menggunakan AI generatif dalam tugas ini.</w:t>
       </w:r>
     </w:p>
     <w:p>
@@ -7388,6 +7387,7 @@
     <w:p>
       <w:pPr>
         <w:pStyle w:val="Heading1"/>
+        <w:pageBreakBefore/>
         <w:rPr/>
       </w:pPr>
       <w:r>
@@ -7406,7 +7406,7 @@
         <w:rPr>
           <w:i w:val="false"/>
         </w:rPr>
-        <w:t>Lembar ini memenuhi syarat kerja sama dan pembagian peran (15% bobot penilaian). Setiap anggota menandatangani pernyataan keaslian di bawah.</w:t>
+        <w:t>Lembar ini memenuhi syarat kerja sama dan pembagian peran (15% bobot penilaian) pada lembar tugas K-1.</w:t>
       </w:r>
     </w:p>
     <w:tbl>
@@ -7783,281 +7783,6 @@
         <w:pStyle w:val="Normal"/>
         <w:spacing w:before="0" w:after="120"/>
         <w:jc w:val="both"/>
-        <w:rPr/>
-      </w:pPr>
-      <w:r>
-        <w:rPr/>
-      </w:r>
-    </w:p>
-    <w:p>
-      <w:pPr>
-        <w:pStyle w:val="Normal"/>
-        <w:spacing w:before="0" w:after="120"/>
-        <w:jc w:val="both"/>
-        <w:rPr/>
-      </w:pPr>
-      <w:r>
-        <w:rPr>
-          <w:i w:val="false"/>
-        </w:rPr>
-        <w:t>Pernyataan keaslian</w:t>
-      </w:r>
-    </w:p>
-    <w:p>
-      <w:pPr>
-        <w:pStyle w:val="Normal"/>
-        <w:spacing w:before="0" w:after="120"/>
-        <w:jc w:val="both"/>
-        <w:rPr/>
-      </w:pPr>
-      <w:r>
-        <w:rPr>
-          <w:i w:val="false"/>
-        </w:rPr>
-        <w:t>Saya yang bertanda tangan di bawah ini menyatakan bahwa laporan ini merupakan hasil kerja kelompok kami sendiri, disusun berdasarkan praktik yang benar-benar dijalankan, dan seluruh sumber yang dikutip telah dicantumkan pada daftar pustaka. Penggunaan alat bantu AI generatif telah diungkapkan pada Lampiran B.</w:t>
-      </w:r>
-    </w:p>
-    <w:tbl>
-      <w:tblPr>
-        <w:tblW w:w="8618" w:type="dxa"/>
-        <w:jc w:val="center"/>
-        <w:tblInd w:w="0" w:type="dxa"/>
-        <w:tblLayout w:type="fixed"/>
-        <w:tblCellMar>
-          <w:top w:w="0" w:type="dxa"/>
-          <w:left w:w="108" w:type="dxa"/>
-          <w:bottom w:w="0" w:type="dxa"/>
-          <w:right w:w="108" w:type="dxa"/>
-        </w:tblCellMar>
-        <w:tblLook w:val="04a0" w:noHBand="0" w:noVBand="1" w:firstColumn="1" w:lastRow="0" w:lastColumn="0" w:firstRow="1"/>
-      </w:tblPr>
-      <w:tblGrid>
-        <w:gridCol w:w="3968"/>
-        <w:gridCol w:w="4649"/>
-      </w:tblGrid>
-      <w:tr>
-        <w:trPr>
-          <w:tblHeader w:val="true"/>
-          <w:cantSplit w:val="true"/>
-        </w:trPr>
-        <w:tc>
-          <w:tcPr>
-            <w:tcW w:w="3968" w:type="dxa"/>
-            <w:tcBorders>
-              <w:top w:val="single" w:sz="4" w:space="0" w:color="A6A6A6"/>
-              <w:left w:val="single" w:sz="4" w:space="0" w:color="A6A6A6"/>
-              <w:bottom w:val="single" w:sz="4" w:space="0" w:color="A6A6A6"/>
-              <w:right w:val="single" w:sz="4" w:space="0" w:color="A6A6A6"/>
-            </w:tcBorders>
-            <w:shd w:color="auto" w:fill="D9E2F3" w:val="clear"/>
-          </w:tcPr>
-          <w:p>
-            <w:pPr>
-              <w:pStyle w:val="Normal"/>
-              <w:spacing w:before="40" w:after="40"/>
-              <w:rPr/>
-            </w:pPr>
-            <w:r>
-              <w:rPr>
-                <w:b/>
-                <w:sz w:val="18"/>
-              </w:rPr>
-              <w:t>Nama / NIM</w:t>
-            </w:r>
-          </w:p>
-        </w:tc>
-        <w:tc>
-          <w:tcPr>
-            <w:tcW w:w="4649" w:type="dxa"/>
-            <w:tcBorders>
-              <w:top w:val="single" w:sz="4" w:space="0" w:color="A6A6A6"/>
-              <w:left w:val="single" w:sz="4" w:space="0" w:color="A6A6A6"/>
-              <w:bottom w:val="single" w:sz="4" w:space="0" w:color="A6A6A6"/>
-              <w:right w:val="single" w:sz="4" w:space="0" w:color="A6A6A6"/>
-            </w:tcBorders>
-            <w:shd w:color="auto" w:fill="D9E2F3" w:val="clear"/>
-          </w:tcPr>
-          <w:p>
-            <w:pPr>
-              <w:pStyle w:val="Normal"/>
-              <w:spacing w:before="40" w:after="40"/>
-              <w:rPr/>
-            </w:pPr>
-            <w:r>
-              <w:rPr>
-                <w:b/>
-                <w:sz w:val="18"/>
-              </w:rPr>
-              <w:t>Tanda tangan dan tanggal</w:t>
-            </w:r>
-          </w:p>
-        </w:tc>
-      </w:tr>
-      <w:tr>
-        <w:trPr>
-          <w:cantSplit w:val="true"/>
-        </w:trPr>
-        <w:tc>
-          <w:tcPr>
-            <w:tcW w:w="3968" w:type="dxa"/>
-            <w:tcBorders>
-              <w:top w:val="single" w:sz="4" w:space="0" w:color="A6A6A6"/>
-              <w:left w:val="single" w:sz="4" w:space="0" w:color="A6A6A6"/>
-              <w:bottom w:val="single" w:sz="4" w:space="0" w:color="A6A6A6"/>
-              <w:right w:val="single" w:sz="4" w:space="0" w:color="A6A6A6"/>
-            </w:tcBorders>
-          </w:tcPr>
-          <w:p>
-            <w:pPr>
-              <w:pStyle w:val="Normal"/>
-              <w:spacing w:before="40" w:after="40"/>
-              <w:rPr/>
-            </w:pPr>
-            <w:r>
-              <w:rPr>
-                <w:sz w:val="18"/>
-              </w:rPr>
-              <w:t>Dendy Zainal Mutaqien / 250660121068</w:t>
-            </w:r>
-          </w:p>
-        </w:tc>
-        <w:tc>
-          <w:tcPr>
-            <w:tcW w:w="4649" w:type="dxa"/>
-            <w:tcBorders>
-              <w:top w:val="single" w:sz="4" w:space="0" w:color="A6A6A6"/>
-              <w:left w:val="single" w:sz="4" w:space="0" w:color="A6A6A6"/>
-              <w:bottom w:val="single" w:sz="4" w:space="0" w:color="A6A6A6"/>
-              <w:right w:val="single" w:sz="4" w:space="0" w:color="A6A6A6"/>
-            </w:tcBorders>
-          </w:tcPr>
-          <w:p>
-            <w:pPr>
-              <w:pStyle w:val="Normal"/>
-              <w:spacing w:before="40" w:after="40"/>
-              <w:rPr/>
-            </w:pPr>
-            <w:r>
-              <w:rPr/>
-            </w:r>
-          </w:p>
-        </w:tc>
-      </w:tr>
-      <w:tr>
-        <w:trPr>
-          <w:cantSplit w:val="true"/>
-        </w:trPr>
-        <w:tc>
-          <w:tcPr>
-            <w:tcW w:w="3968" w:type="dxa"/>
-            <w:tcBorders>
-              <w:top w:val="single" w:sz="4" w:space="0" w:color="A6A6A6"/>
-              <w:left w:val="single" w:sz="4" w:space="0" w:color="A6A6A6"/>
-              <w:bottom w:val="single" w:sz="4" w:space="0" w:color="A6A6A6"/>
-              <w:right w:val="single" w:sz="4" w:space="0" w:color="A6A6A6"/>
-            </w:tcBorders>
-          </w:tcPr>
-          <w:p>
-            <w:pPr>
-              <w:pStyle w:val="Normal"/>
-              <w:spacing w:before="40" w:after="40"/>
-              <w:rPr/>
-            </w:pPr>
-            <w:r>
-              <w:rPr>
-                <w:sz w:val="18"/>
-              </w:rPr>
-              <w:t>R.Sangga Buana / 250660121021</w:t>
-            </w:r>
-            <w:r>
-              <w:rPr>
-                <w:sz w:val="18"/>
-              </w:rPr>
-            </w:r>
-          </w:p>
-        </w:tc>
-        <w:tc>
-          <w:tcPr>
-            <w:tcW w:w="4649" w:type="dxa"/>
-            <w:tcBorders>
-              <w:top w:val="single" w:sz="4" w:space="0" w:color="A6A6A6"/>
-              <w:left w:val="single" w:sz="4" w:space="0" w:color="A6A6A6"/>
-              <w:bottom w:val="single" w:sz="4" w:space="0" w:color="A6A6A6"/>
-              <w:right w:val="single" w:sz="4" w:space="0" w:color="A6A6A6"/>
-            </w:tcBorders>
-          </w:tcPr>
-          <w:p>
-            <w:pPr>
-              <w:pStyle w:val="Normal"/>
-              <w:spacing w:before="40" w:after="40"/>
-              <w:rPr/>
-            </w:pPr>
-            <w:r>
-              <w:rPr/>
-            </w:r>
-          </w:p>
-        </w:tc>
-      </w:tr>
-      <w:tr>
-        <w:trPr>
-          <w:cantSplit w:val="true"/>
-        </w:trPr>
-        <w:tc>
-          <w:tcPr>
-            <w:tcW w:w="3968" w:type="dxa"/>
-            <w:tcBorders>
-              <w:top w:val="single" w:sz="4" w:space="0" w:color="A6A6A6"/>
-              <w:left w:val="single" w:sz="4" w:space="0" w:color="A6A6A6"/>
-              <w:bottom w:val="single" w:sz="4" w:space="0" w:color="A6A6A6"/>
-              <w:right w:val="single" w:sz="4" w:space="0" w:color="A6A6A6"/>
-            </w:tcBorders>
-          </w:tcPr>
-          <w:p>
-            <w:pPr>
-              <w:pStyle w:val="Normal"/>
-              <w:spacing w:before="40" w:after="40"/>
-              <w:rPr/>
-            </w:pPr>
-            <w:r>
-              <w:rPr>
-                <w:sz w:val="18"/>
-              </w:rPr>
-              <w:t>M.Azkal Azkiya / 250660121107</w:t>
-            </w:r>
-            <w:r>
-              <w:rPr>
-                <w:sz w:val="18"/>
-              </w:rPr>
-            </w:r>
-          </w:p>
-        </w:tc>
-        <w:tc>
-          <w:tcPr>
-            <w:tcW w:w="4649" w:type="dxa"/>
-            <w:tcBorders>
-              <w:top w:val="single" w:sz="4" w:space="0" w:color="A6A6A6"/>
-              <w:left w:val="single" w:sz="4" w:space="0" w:color="A6A6A6"/>
-              <w:bottom w:val="single" w:sz="4" w:space="0" w:color="A6A6A6"/>
-              <w:right w:val="single" w:sz="4" w:space="0" w:color="A6A6A6"/>
-            </w:tcBorders>
-          </w:tcPr>
-          <w:p>
-            <w:pPr>
-              <w:pStyle w:val="Normal"/>
-              <w:spacing w:before="40" w:after="40"/>
-              <w:rPr/>
-            </w:pPr>
-            <w:r>
-              <w:rPr/>
-            </w:r>
-          </w:p>
-        </w:tc>
-      </w:tr>
-    </w:tbl>
-    <w:p>
-      <w:pPr>
-        <w:pStyle w:val="Normal"/>
-        <w:spacing w:before="0" w:after="80"/>
         <w:rPr/>
       </w:pPr>
       <w:r>

</xml_diff>

<commit_message>
Lingkungan praktik: RAM 16 GiB sesuai spesifikasi perangkat
Angka RAM diisi pemilik laporan menurut spesifikasi pabrik; MemTotal sistem
terbaca 14,9 GiB karena dibagi ke GPU terintegrasi.

Co-Authored-By: Claude Code <noreply@anthropic.com>
</commit_message>
<xml_diff>
--- a/results/IF-3C_K-1_250660121068_Dendy Zainal Mutaqien.docx
+++ b/results/IF-3C_K-1_250660121068_Dendy Zainal Mutaqien.docx
@@ -728,8 +728,10 @@
     </w:p>
     <w:p>
       <w:pPr>
-        <w:spacing w:after="280"/>
+        <w:pStyle w:val="Normal"/>
+        <w:spacing w:before="0" w:after="280"/>
         <w:jc w:val="center"/>
+        <w:rPr/>
       </w:pPr>
       <w:r>
         <w:rPr>
@@ -741,11 +743,14 @@
     </w:p>
     <w:p>
       <w:pPr>
+        <w:pStyle w:val="Normal"/>
         <w:tabs>
-          <w:tab w:pos="8617" w:val="right" w:leader="dot"/>
+          <w:tab w:val="clear" w:pos="420"/>
+          <w:tab w:val="right" w:pos="8617" w:leader="dot"/>
         </w:tabs>
-        <w:spacing w:after="60"/>
+        <w:spacing w:before="0" w:after="60"/>
         <w:ind w:left="0"/>
+        <w:rPr/>
       </w:pPr>
       <w:r>
         <w:rPr>
@@ -759,15 +764,18 @@
     </w:p>
     <w:p>
       <w:pPr>
+        <w:pStyle w:val="Normal"/>
         <w:tabs>
-          <w:tab w:pos="8617" w:val="right" w:leader="dot"/>
+          <w:tab w:val="clear" w:pos="420"/>
+          <w:tab w:val="right" w:pos="8617" w:leader="dot"/>
         </w:tabs>
-        <w:spacing w:after="60"/>
+        <w:spacing w:before="0" w:after="60"/>
         <w:ind w:left="340"/>
-      </w:pPr>
-      <w:r>
-        <w:rPr>
-          <w:b w:val="0"/>
+        <w:rPr/>
+      </w:pPr>
+      <w:r>
+        <w:rPr>
+          <w:b w:val="false"/>
           <w:sz w:val="19"/>
         </w:rPr>
         <w:t>1.1 Latar belakang kasus</w:t>
@@ -777,15 +785,18 @@
     </w:p>
     <w:p>
       <w:pPr>
+        <w:pStyle w:val="Normal"/>
         <w:tabs>
-          <w:tab w:pos="8617" w:val="right" w:leader="dot"/>
+          <w:tab w:val="clear" w:pos="420"/>
+          <w:tab w:val="right" w:pos="8617" w:leader="dot"/>
         </w:tabs>
-        <w:spacing w:after="60"/>
+        <w:spacing w:before="0" w:after="60"/>
         <w:ind w:left="340"/>
-      </w:pPr>
-      <w:r>
-        <w:rPr>
-          <w:b w:val="0"/>
+        <w:rPr/>
+      </w:pPr>
+      <w:r>
+        <w:rPr>
+          <w:b w:val="false"/>
           <w:sz w:val="19"/>
         </w:rPr>
         <w:t>1.2 Tujuan tugas</w:t>
@@ -795,15 +806,18 @@
     </w:p>
     <w:p>
       <w:pPr>
+        <w:pStyle w:val="Normal"/>
         <w:tabs>
-          <w:tab w:pos="8617" w:val="right" w:leader="dot"/>
+          <w:tab w:val="clear" w:pos="420"/>
+          <w:tab w:val="right" w:pos="8617" w:leader="dot"/>
         </w:tabs>
-        <w:spacing w:after="60"/>
+        <w:spacing w:before="0" w:after="60"/>
         <w:ind w:left="340"/>
-      </w:pPr>
-      <w:r>
-        <w:rPr>
-          <w:b w:val="0"/>
+        <w:rPr/>
+      </w:pPr>
+      <w:r>
+        <w:rPr>
+          <w:b w:val="false"/>
           <w:sz w:val="19"/>
         </w:rPr>
         <w:t>1.3 Ruang lingkup</w:t>
@@ -813,11 +827,14 @@
     </w:p>
     <w:p>
       <w:pPr>
+        <w:pStyle w:val="Normal"/>
         <w:tabs>
-          <w:tab w:pos="8617" w:val="right" w:leader="dot"/>
+          <w:tab w:val="clear" w:pos="420"/>
+          <w:tab w:val="right" w:pos="8617" w:leader="dot"/>
         </w:tabs>
-        <w:spacing w:after="60"/>
+        <w:spacing w:before="0" w:after="60"/>
         <w:ind w:left="0"/>
+        <w:rPr/>
       </w:pPr>
       <w:r>
         <w:rPr>
@@ -831,11 +848,14 @@
     </w:p>
     <w:p>
       <w:pPr>
+        <w:pStyle w:val="Normal"/>
         <w:tabs>
-          <w:tab w:pos="8617" w:val="right" w:leader="dot"/>
+          <w:tab w:val="clear" w:pos="420"/>
+          <w:tab w:val="right" w:pos="8617" w:leader="dot"/>
         </w:tabs>
-        <w:spacing w:after="60"/>
+        <w:spacing w:before="0" w:after="60"/>
         <w:ind w:left="0"/>
+        <w:rPr/>
       </w:pPr>
       <w:r>
         <w:rPr>
@@ -849,11 +869,14 @@
     </w:p>
     <w:p>
       <w:pPr>
+        <w:pStyle w:val="Normal"/>
         <w:tabs>
-          <w:tab w:pos="8617" w:val="right" w:leader="dot"/>
+          <w:tab w:val="clear" w:pos="420"/>
+          <w:tab w:val="right" w:pos="8617" w:leader="dot"/>
         </w:tabs>
-        <w:spacing w:after="60"/>
+        <w:spacing w:before="0" w:after="60"/>
         <w:ind w:left="0"/>
+        <w:rPr/>
       </w:pPr>
       <w:r>
         <w:rPr>
@@ -867,15 +890,18 @@
     </w:p>
     <w:p>
       <w:pPr>
+        <w:pStyle w:val="Normal"/>
         <w:tabs>
-          <w:tab w:pos="8617" w:val="right" w:leader="dot"/>
+          <w:tab w:val="clear" w:pos="420"/>
+          <w:tab w:val="right" w:pos="8617" w:leader="dot"/>
         </w:tabs>
-        <w:spacing w:after="60"/>
+        <w:spacing w:before="0" w:after="60"/>
         <w:ind w:left="340"/>
-      </w:pPr>
-      <w:r>
-        <w:rPr>
-          <w:b w:val="0"/>
+        <w:rPr/>
+      </w:pPr>
+      <w:r>
+        <w:rPr>
+          <w:b w:val="false"/>
           <w:sz w:val="19"/>
         </w:rPr>
         <w:t>4.1 Langkah 1: Menyiapkan lingkungan dan broker</w:t>
@@ -885,15 +911,18 @@
     </w:p>
     <w:p>
       <w:pPr>
+        <w:pStyle w:val="Normal"/>
         <w:tabs>
-          <w:tab w:pos="8617" w:val="right" w:leader="dot"/>
+          <w:tab w:val="clear" w:pos="420"/>
+          <w:tab w:val="right" w:pos="8617" w:leader="dot"/>
         </w:tabs>
-        <w:spacing w:after="60"/>
+        <w:spacing w:before="0" w:after="60"/>
         <w:ind w:left="340"/>
-      </w:pPr>
-      <w:r>
-        <w:rPr>
-          <w:b w:val="0"/>
+        <w:rPr/>
+      </w:pPr>
+      <w:r>
+        <w:rPr>
+          <w:b w:val="false"/>
           <w:sz w:val="19"/>
         </w:rPr>
         <w:t>4.2 Langkah 2: Menyeragamkan format pesan</w:t>
@@ -903,15 +932,18 @@
     </w:p>
     <w:p>
       <w:pPr>
+        <w:pStyle w:val="Normal"/>
         <w:tabs>
-          <w:tab w:pos="8617" w:val="right" w:leader="dot"/>
+          <w:tab w:val="clear" w:pos="420"/>
+          <w:tab w:val="right" w:pos="8617" w:leader="dot"/>
         </w:tabs>
-        <w:spacing w:after="60"/>
+        <w:spacing w:before="0" w:after="60"/>
         <w:ind w:left="340"/>
-      </w:pPr>
-      <w:r>
-        <w:rPr>
-          <w:b w:val="0"/>
+        <w:rPr/>
+      </w:pPr>
+      <w:r>
+        <w:rPr>
+          <w:b w:val="false"/>
           <w:sz w:val="19"/>
         </w:rPr>
         <w:t>4.3 Langkah 3: Implementasi pipe</w:t>
@@ -921,15 +953,18 @@
     </w:p>
     <w:p>
       <w:pPr>
+        <w:pStyle w:val="Normal"/>
         <w:tabs>
-          <w:tab w:pos="8617" w:val="right" w:leader="dot"/>
+          <w:tab w:val="clear" w:pos="420"/>
+          <w:tab w:val="right" w:pos="8617" w:leader="dot"/>
         </w:tabs>
-        <w:spacing w:after="60"/>
+        <w:spacing w:before="0" w:after="60"/>
         <w:ind w:left="340"/>
-      </w:pPr>
-      <w:r>
-        <w:rPr>
-          <w:b w:val="0"/>
+        <w:rPr/>
+      </w:pPr>
+      <w:r>
+        <w:rPr>
+          <w:b w:val="false"/>
           <w:sz w:val="19"/>
         </w:rPr>
         <w:t>4.4 Langkah 4: Implementasi message queue</w:t>
@@ -939,15 +974,18 @@
     </w:p>
     <w:p>
       <w:pPr>
+        <w:pStyle w:val="Normal"/>
         <w:tabs>
-          <w:tab w:pos="8617" w:val="right" w:leader="dot"/>
+          <w:tab w:val="clear" w:pos="420"/>
+          <w:tab w:val="right" w:pos="8617" w:leader="dot"/>
         </w:tabs>
-        <w:spacing w:after="60"/>
+        <w:spacing w:before="0" w:after="60"/>
         <w:ind w:left="340"/>
-      </w:pPr>
-      <w:r>
-        <w:rPr>
-          <w:b w:val="0"/>
+        <w:rPr/>
+      </w:pPr>
+      <w:r>
+        <w:rPr>
+          <w:b w:val="false"/>
           <w:sz w:val="19"/>
         </w:rPr>
         <w:t>4.5 Langkah 5: Implementasi publish-subscribe dengan MQTT</w:t>
@@ -957,15 +995,18 @@
     </w:p>
     <w:p>
       <w:pPr>
+        <w:pStyle w:val="Normal"/>
         <w:tabs>
-          <w:tab w:pos="8617" w:val="right" w:leader="dot"/>
+          <w:tab w:val="clear" w:pos="420"/>
+          <w:tab w:val="right" w:pos="8617" w:leader="dot"/>
         </w:tabs>
-        <w:spacing w:after="60"/>
+        <w:spacing w:before="0" w:after="60"/>
         <w:ind w:left="340"/>
-      </w:pPr>
-      <w:r>
-        <w:rPr>
-          <w:b w:val="0"/>
+        <w:rPr/>
+      </w:pPr>
+      <w:r>
+        <w:rPr>
+          <w:b w:val="false"/>
           <w:sz w:val="19"/>
         </w:rPr>
         <w:t>4.6 Langkah 6: Pengukuran dan pemeriksaan</w:t>
@@ -975,11 +1016,14 @@
     </w:p>
     <w:p>
       <w:pPr>
+        <w:pStyle w:val="Normal"/>
         <w:tabs>
-          <w:tab w:pos="8617" w:val="right" w:leader="dot"/>
+          <w:tab w:val="clear" w:pos="420"/>
+          <w:tab w:val="right" w:pos="8617" w:leader="dot"/>
         </w:tabs>
-        <w:spacing w:after="60"/>
+        <w:spacing w:before="0" w:after="60"/>
         <w:ind w:left="0"/>
+        <w:rPr/>
       </w:pPr>
       <w:r>
         <w:rPr>
@@ -993,15 +1037,18 @@
     </w:p>
     <w:p>
       <w:pPr>
+        <w:pStyle w:val="Normal"/>
         <w:tabs>
-          <w:tab w:pos="8617" w:val="right" w:leader="dot"/>
+          <w:tab w:val="clear" w:pos="420"/>
+          <w:tab w:val="right" w:pos="8617" w:leader="dot"/>
         </w:tabs>
-        <w:spacing w:after="60"/>
+        <w:spacing w:before="0" w:after="60"/>
         <w:ind w:left="340"/>
-      </w:pPr>
-      <w:r>
-        <w:rPr>
-          <w:b w:val="0"/>
+        <w:rPr/>
+      </w:pPr>
+      <w:r>
+        <w:rPr>
+          <w:b w:val="false"/>
           <w:sz w:val="19"/>
         </w:rPr>
         <w:t>5.1 Hasil</w:t>
@@ -1011,15 +1058,18 @@
     </w:p>
     <w:p>
       <w:pPr>
+        <w:pStyle w:val="Normal"/>
         <w:tabs>
-          <w:tab w:pos="8617" w:val="right" w:leader="dot"/>
+          <w:tab w:val="clear" w:pos="420"/>
+          <w:tab w:val="right" w:pos="8617" w:leader="dot"/>
         </w:tabs>
-        <w:spacing w:after="60"/>
+        <w:spacing w:before="0" w:after="60"/>
         <w:ind w:left="340"/>
-      </w:pPr>
-      <w:r>
-        <w:rPr>
-          <w:b w:val="0"/>
+        <w:rPr/>
+      </w:pPr>
+      <w:r>
+        <w:rPr>
+          <w:b w:val="false"/>
           <w:sz w:val="19"/>
         </w:rPr>
         <w:t>5.2 Analisis</w:t>
@@ -1029,15 +1079,18 @@
     </w:p>
     <w:p>
       <w:pPr>
+        <w:pStyle w:val="Normal"/>
         <w:tabs>
-          <w:tab w:pos="8617" w:val="right" w:leader="dot"/>
+          <w:tab w:val="clear" w:pos="420"/>
+          <w:tab w:val="right" w:pos="8617" w:leader="dot"/>
         </w:tabs>
-        <w:spacing w:after="60"/>
+        <w:spacing w:before="0" w:after="60"/>
         <w:ind w:left="340"/>
-      </w:pPr>
-      <w:r>
-        <w:rPr>
-          <w:b w:val="0"/>
+        <w:rPr/>
+      </w:pPr>
+      <w:r>
+        <w:rPr>
+          <w:b w:val="false"/>
           <w:sz w:val="19"/>
         </w:rPr>
         <w:t>5.3 Rekomendasi</w:t>
@@ -1047,11 +1100,14 @@
     </w:p>
     <w:p>
       <w:pPr>
+        <w:pStyle w:val="Normal"/>
         <w:tabs>
-          <w:tab w:pos="8617" w:val="right" w:leader="dot"/>
+          <w:tab w:val="clear" w:pos="420"/>
+          <w:tab w:val="right" w:pos="8617" w:leader="dot"/>
         </w:tabs>
-        <w:spacing w:after="60"/>
+        <w:spacing w:before="0" w:after="60"/>
         <w:ind w:left="0"/>
+        <w:rPr/>
       </w:pPr>
       <w:r>
         <w:rPr>
@@ -1065,11 +1121,14 @@
     </w:p>
     <w:p>
       <w:pPr>
+        <w:pStyle w:val="Normal"/>
         <w:tabs>
-          <w:tab w:pos="8617" w:val="right" w:leader="dot"/>
+          <w:tab w:val="clear" w:pos="420"/>
+          <w:tab w:val="right" w:pos="8617" w:leader="dot"/>
         </w:tabs>
-        <w:spacing w:after="60"/>
+        <w:spacing w:before="0" w:after="60"/>
         <w:ind w:left="0"/>
+        <w:rPr/>
       </w:pPr>
       <w:r>
         <w:rPr>
@@ -1083,11 +1142,14 @@
     </w:p>
     <w:p>
       <w:pPr>
+        <w:pStyle w:val="Normal"/>
         <w:tabs>
-          <w:tab w:pos="8617" w:val="right" w:leader="dot"/>
+          <w:tab w:val="clear" w:pos="420"/>
+          <w:tab w:val="right" w:pos="8617" w:leader="dot"/>
         </w:tabs>
-        <w:spacing w:after="60"/>
+        <w:spacing w:before="0" w:after="60"/>
         <w:ind w:left="0"/>
+        <w:rPr/>
       </w:pPr>
       <w:r>
         <w:rPr>
@@ -1101,11 +1163,14 @@
     </w:p>
     <w:p>
       <w:pPr>
+        <w:pStyle w:val="Normal"/>
         <w:tabs>
-          <w:tab w:pos="8617" w:val="right" w:leader="dot"/>
+          <w:tab w:val="clear" w:pos="420"/>
+          <w:tab w:val="right" w:pos="8617" w:leader="dot"/>
         </w:tabs>
-        <w:spacing w:after="60"/>
+        <w:spacing w:before="0" w:after="60"/>
         <w:ind w:left="0"/>
+        <w:rPr/>
       </w:pPr>
       <w:r>
         <w:rPr>
@@ -1119,11 +1184,14 @@
     </w:p>
     <w:p>
       <w:pPr>
+        <w:pStyle w:val="Normal"/>
         <w:tabs>
-          <w:tab w:pos="8617" w:val="right" w:leader="dot"/>
+          <w:tab w:val="clear" w:pos="420"/>
+          <w:tab w:val="right" w:pos="8617" w:leader="dot"/>
         </w:tabs>
-        <w:spacing w:after="60"/>
+        <w:spacing w:before="0" w:after="60"/>
         <w:ind w:left="0"/>
+        <w:rPr/>
       </w:pPr>
       <w:r>
         <w:rPr>
@@ -1137,11 +1205,14 @@
     </w:p>
     <w:p>
       <w:pPr>
+        <w:pStyle w:val="Normal"/>
         <w:tabs>
-          <w:tab w:pos="8617" w:val="right" w:leader="dot"/>
+          <w:tab w:val="clear" w:pos="420"/>
+          <w:tab w:val="right" w:pos="8617" w:leader="dot"/>
         </w:tabs>
-        <w:spacing w:after="60"/>
+        <w:spacing w:before="0" w:after="60"/>
         <w:ind w:left="0"/>
+        <w:rPr/>
       </w:pPr>
       <w:r>
         <w:rPr>
@@ -1155,15 +1226,18 @@
     </w:p>
     <w:p>
       <w:pPr>
+        <w:pStyle w:val="Normal"/>
         <w:tabs>
-          <w:tab w:pos="8617" w:val="right" w:leader="dot"/>
+          <w:tab w:val="clear" w:pos="420"/>
+          <w:tab w:val="right" w:pos="8617" w:leader="dot"/>
         </w:tabs>
-        <w:spacing w:after="60"/>
+        <w:spacing w:before="0" w:after="60"/>
         <w:ind w:left="340"/>
-      </w:pPr>
-      <w:r>
-        <w:rPr>
-          <w:b w:val="0"/>
+        <w:rPr/>
+      </w:pPr>
+      <w:r>
+        <w:rPr>
+          <w:b w:val="false"/>
           <w:sz w:val="19"/>
         </w:rPr>
         <w:t>Swa-nilai berdasarkan kriteria lembar tugas</w:t>
@@ -1173,11 +1247,14 @@
     </w:p>
     <w:p>
       <w:pPr>
+        <w:pStyle w:val="Normal"/>
         <w:tabs>
-          <w:tab w:pos="8617" w:val="right" w:leader="dot"/>
+          <w:tab w:val="clear" w:pos="420"/>
+          <w:tab w:val="right" w:pos="8617" w:leader="dot"/>
         </w:tabs>
-        <w:spacing w:after="60"/>
+        <w:spacing w:before="0" w:after="60"/>
         <w:ind w:left="0"/>
+        <w:rPr/>
       </w:pPr>
       <w:r>
         <w:rPr>
@@ -1190,11 +1267,27 @@
       </w:r>
     </w:p>
     <w:p>
+      <w:pPr>
+        <w:pStyle w:val="Normal"/>
+        <w:rPr/>
+      </w:pPr>
+      <w:r>
+        <w:rPr/>
+      </w:r>
       <w:r>
         <w:br w:type="page"/>
       </w:r>
     </w:p>
-    <w:p/>
+    <w:p>
+      <w:pPr>
+        <w:pStyle w:val="Normal"/>
+        <w:spacing w:before="0" w:after="0"/>
+        <w:rPr/>
+      </w:pPr>
+      <w:r>
+        <w:rPr/>
+      </w:r>
+    </w:p>
     <w:p>
       <w:pPr>
         <w:pStyle w:val="Heading1"/>
@@ -1645,7 +1738,19 @@
               <w:rPr>
                 <w:sz w:val="18"/>
               </w:rPr>
-              <w:t>elementary OS 8, AMD Ryzen 7 7735HS, RAM 14 GiB, kernel 7.0.0-34-generic</w:t>
+              <w:t>elementary OS 8, AMD Ryzen 7 7735HS, RAM 1</w:t>
+            </w:r>
+            <w:r>
+              <w:rPr>
+                <w:sz w:val="18"/>
+              </w:rPr>
+              <w:t>6</w:t>
+            </w:r>
+            <w:r>
+              <w:rPr>
+                <w:sz w:val="18"/>
+              </w:rPr>
+              <w:t xml:space="preserve"> GiB, kernel 7.0.0-34-generic</w:t>
             </w:r>
           </w:p>
         </w:tc>
@@ -4301,8 +4406,8 @@
       <w:tblGrid>
         <w:gridCol w:w="2835"/>
         <w:gridCol w:w="2494"/>
-        <w:gridCol w:w="2043"/>
-        <w:gridCol w:w="2492"/>
+        <w:gridCol w:w="2044"/>
+        <w:gridCol w:w="2491"/>
       </w:tblGrid>
       <w:tr>
         <w:trPr>
@@ -4363,7 +4468,7 @@
         </w:tc>
         <w:tc>
           <w:tcPr>
-            <w:tcW w:w="2043" w:type="dxa"/>
+            <w:tcW w:w="2044" w:type="dxa"/>
             <w:tcBorders>
               <w:top w:val="single" w:sz="4" w:space="0" w:color="A6A6A6"/>
               <w:left w:val="single" w:sz="4" w:space="0" w:color="A6A6A6"/>
@@ -4389,7 +4494,7 @@
         </w:tc>
         <w:tc>
           <w:tcPr>
-            <w:tcW w:w="2492" w:type="dxa"/>
+            <w:tcW w:w="2491" w:type="dxa"/>
             <w:tcBorders>
               <w:top w:val="single" w:sz="4" w:space="0" w:color="A6A6A6"/>
               <w:left w:val="single" w:sz="4" w:space="0" w:color="A6A6A6"/>
@@ -4468,7 +4573,7 @@
         </w:tc>
         <w:tc>
           <w:tcPr>
-            <w:tcW w:w="2043" w:type="dxa"/>
+            <w:tcW w:w="2044" w:type="dxa"/>
             <w:tcBorders>
               <w:top w:val="single" w:sz="4" w:space="0" w:color="A6A6A6"/>
               <w:left w:val="single" w:sz="4" w:space="0" w:color="A6A6A6"/>
@@ -4492,7 +4597,7 @@
         </w:tc>
         <w:tc>
           <w:tcPr>
-            <w:tcW w:w="2492" w:type="dxa"/>
+            <w:tcW w:w="2491" w:type="dxa"/>
             <w:tcBorders>
               <w:top w:val="single" w:sz="4" w:space="0" w:color="A6A6A6"/>
               <w:left w:val="single" w:sz="4" w:space="0" w:color="A6A6A6"/>
@@ -4569,7 +4674,7 @@
         </w:tc>
         <w:tc>
           <w:tcPr>
-            <w:tcW w:w="2043" w:type="dxa"/>
+            <w:tcW w:w="2044" w:type="dxa"/>
             <w:tcBorders>
               <w:top w:val="single" w:sz="4" w:space="0" w:color="A6A6A6"/>
               <w:left w:val="single" w:sz="4" w:space="0" w:color="A6A6A6"/>
@@ -4593,7 +4698,7 @@
         </w:tc>
         <w:tc>
           <w:tcPr>
-            <w:tcW w:w="2492" w:type="dxa"/>
+            <w:tcW w:w="2491" w:type="dxa"/>
             <w:tcBorders>
               <w:top w:val="single" w:sz="4" w:space="0" w:color="A6A6A6"/>
               <w:left w:val="single" w:sz="4" w:space="0" w:color="A6A6A6"/>
@@ -6531,12 +6636,13 @@
         <w:rPr>
           <w:i w:val="false"/>
         </w:rPr>
-        <w:t>☐  Kami tidak menggunakan AI generatif dalam tugas ini.</w:t>
+        <w:t xml:space="preserve">☐  </w:t>
       </w:r>
       <w:r>
         <w:rPr>
           <w:i w:val="false"/>
         </w:rPr>
+        <w:t>Kami tidak menggunakan AI generatif dalam tugas ini.</w:t>
       </w:r>
     </w:p>
     <w:p>
@@ -6834,10 +6940,11 @@
       </w:pPr>
       <w:r>
         <w:rPr/>
-        <w:t>☒  Identitas, kode tugas, dan nama host pada sampul sudah benar.</w:t>
-      </w:r>
-      <w:r>
-        <w:rPr/>
+        <w:t xml:space="preserve">☒  </w:t>
+      </w:r>
+      <w:r>
+        <w:rPr/>
+        <w:t>Identitas, kode tugas, dan nama host pada sampul sudah benar.</w:t>
       </w:r>
     </w:p>
     <w:p>
@@ -6878,10 +6985,11 @@
       </w:pPr>
       <w:r>
         <w:rPr/>
-        <w:t>☒  Kepingan puzzle sudah disimpan di portofolio dan tautannya dicantumkan.</w:t>
-      </w:r>
-      <w:r>
-        <w:rPr/>
+        <w:t xml:space="preserve">☒  </w:t>
+      </w:r>
+      <w:r>
+        <w:rPr/>
+        <w:t>Kepingan puzzle sudah disimpan di portofolio dan tautannya dicantumkan.</w:t>
       </w:r>
     </w:p>
     <w:p>
@@ -6907,10 +7015,11 @@
       </w:pPr>
       <w:r>
         <w:rPr/>
-        <w:t>☒  Lembar kontribusi anggota sudah dilampirkan.</w:t>
-      </w:r>
-      <w:r>
-        <w:rPr/>
+        <w:t xml:space="preserve">☒  </w:t>
+      </w:r>
+      <w:r>
+        <w:rPr/>
+        <w:t>Lembar kontribusi anggota sudah dilampirkan.</w:t>
       </w:r>
     </w:p>
     <w:p>
@@ -6921,10 +7030,11 @@
       </w:pPr>
       <w:r>
         <w:rPr/>
-        <w:t>☒  Daftar isi sudah diperbarui dan nomor halamannya cocok.</w:t>
-      </w:r>
-      <w:r>
-        <w:rPr/>
+        <w:t xml:space="preserve">☒  </w:t>
+      </w:r>
+      <w:r>
+        <w:rPr/>
+        <w:t>Daftar isi sudah diperbarui dan nomor halamannya cocok.</w:t>
       </w:r>
     </w:p>
     <w:p>
@@ -6935,10 +7045,11 @@
       </w:pPr>
       <w:r>
         <w:rPr/>
-        <w:t>☒  Berkas disimpan sebagai PDF dengan nama &lt;Kelas&gt;_&lt;Kode&gt;_&lt;NIM&gt;_&lt;Nama&gt;.pdf.</w:t>
-      </w:r>
-      <w:r>
-        <w:rPr/>
+        <w:t xml:space="preserve">☒  </w:t>
+      </w:r>
+      <w:r>
+        <w:rPr/>
+        <w:t>Berkas disimpan sebagai PDF dengan nama &lt;Kelas&gt;_&lt;Kode&gt;_&lt;NIM&gt;_&lt;Nama&gt;.pdf.</w:t>
       </w:r>
     </w:p>
     <w:p>
@@ -7383,11 +7494,13 @@
       <w:r>
         <w:rPr/>
       </w:r>
+      <w:r>
+        <w:br w:type="page"/>
+      </w:r>
     </w:p>
     <w:p>
       <w:pPr>
         <w:pStyle w:val="Heading1"/>
-        <w:pageBreakBefore/>
         <w:rPr/>
       </w:pPr>
       <w:r>

</xml_diff>

<commit_message>
Tabel: rata kiri untuk semua sel
Sel tabel mewarisi justify dari gaya Normal, sehingga kolom sempit
merentangkan kata dan angka.

Co-Authored-By: Claude Code <noreply@anthropic.com>
</commit_message>
<xml_diff>
--- a/results/IF-3C_K-1_250660121068_Dendy Zainal Mutaqien.docx
+++ b/results/IF-3C_K-1_250660121068_Dendy Zainal Mutaqien.docx
@@ -128,6 +128,7 @@
             <w:pPr>
               <w:pStyle w:val="Normal"/>
               <w:spacing w:before="40" w:after="40"/>
+              <w:jc w:val="left"/>
               <w:rPr/>
             </w:pPr>
             <w:r>
@@ -154,6 +155,7 @@
             <w:pPr>
               <w:pStyle w:val="Normal"/>
               <w:spacing w:before="40" w:after="40"/>
+              <w:jc w:val="left"/>
               <w:rPr/>
             </w:pPr>
             <w:r>
@@ -184,6 +186,7 @@
             <w:pPr>
               <w:pStyle w:val="Normal"/>
               <w:spacing w:before="40" w:after="40"/>
+              <w:jc w:val="left"/>
               <w:rPr/>
             </w:pPr>
             <w:r>
@@ -208,6 +211,7 @@
             <w:pPr>
               <w:pStyle w:val="Normal"/>
               <w:spacing w:before="40" w:after="40"/>
+              <w:jc w:val="left"/>
               <w:rPr/>
             </w:pPr>
             <w:r>
@@ -237,6 +241,7 @@
             <w:pPr>
               <w:pStyle w:val="Normal"/>
               <w:spacing w:before="40" w:after="40"/>
+              <w:jc w:val="left"/>
               <w:rPr/>
             </w:pPr>
             <w:r>
@@ -261,6 +266,7 @@
             <w:pPr>
               <w:pStyle w:val="Normal"/>
               <w:spacing w:before="40" w:after="40"/>
+              <w:jc w:val="left"/>
               <w:rPr/>
             </w:pPr>
             <w:r>
@@ -290,6 +296,7 @@
             <w:pPr>
               <w:pStyle w:val="Normal"/>
               <w:spacing w:before="40" w:after="40"/>
+              <w:jc w:val="left"/>
               <w:rPr/>
             </w:pPr>
             <w:r>
@@ -314,6 +321,7 @@
             <w:pPr>
               <w:pStyle w:val="Normal"/>
               <w:spacing w:before="40" w:after="40"/>
+              <w:jc w:val="left"/>
               <w:rPr/>
             </w:pPr>
             <w:r>
@@ -343,6 +351,7 @@
             <w:pPr>
               <w:pStyle w:val="Normal"/>
               <w:spacing w:before="40" w:after="40"/>
+              <w:jc w:val="left"/>
               <w:rPr/>
             </w:pPr>
             <w:r>
@@ -367,6 +376,7 @@
             <w:pPr>
               <w:pStyle w:val="Normal"/>
               <w:spacing w:before="40" w:after="40"/>
+              <w:jc w:val="left"/>
               <w:rPr/>
             </w:pPr>
             <w:r>
@@ -396,6 +406,7 @@
             <w:pPr>
               <w:pStyle w:val="Normal"/>
               <w:spacing w:before="40" w:after="40"/>
+              <w:jc w:val="left"/>
               <w:rPr/>
             </w:pPr>
             <w:r>
@@ -420,6 +431,7 @@
             <w:pPr>
               <w:pStyle w:val="Normal"/>
               <w:spacing w:before="40" w:after="40"/>
+              <w:jc w:val="left"/>
               <w:rPr/>
             </w:pPr>
             <w:r>
@@ -449,6 +461,7 @@
             <w:pPr>
               <w:pStyle w:val="Normal"/>
               <w:spacing w:before="40" w:after="40"/>
+              <w:jc w:val="left"/>
               <w:rPr/>
             </w:pPr>
             <w:r>
@@ -473,6 +486,7 @@
             <w:pPr>
               <w:pStyle w:val="Normal"/>
               <w:spacing w:before="40" w:after="40"/>
+              <w:jc w:val="left"/>
               <w:rPr/>
             </w:pPr>
             <w:r>
@@ -502,6 +516,7 @@
             <w:pPr>
               <w:pStyle w:val="Normal"/>
               <w:spacing w:before="40" w:after="40"/>
+              <w:jc w:val="left"/>
               <w:rPr/>
             </w:pPr>
             <w:r>
@@ -526,6 +541,7 @@
             <w:pPr>
               <w:pStyle w:val="Normal"/>
               <w:spacing w:before="40" w:after="40"/>
+              <w:jc w:val="left"/>
               <w:rPr/>
             </w:pPr>
             <w:r>
@@ -555,6 +571,7 @@
             <w:pPr>
               <w:pStyle w:val="Normal"/>
               <w:spacing w:before="40" w:after="40"/>
+              <w:jc w:val="left"/>
               <w:rPr/>
             </w:pPr>
             <w:r>
@@ -579,6 +596,7 @@
             <w:pPr>
               <w:pStyle w:val="Normal"/>
               <w:spacing w:before="40" w:after="40"/>
+              <w:jc w:val="left"/>
               <w:rPr/>
             </w:pPr>
             <w:r>
@@ -608,6 +626,7 @@
             <w:pPr>
               <w:pStyle w:val="Normal"/>
               <w:spacing w:before="40" w:after="40"/>
+              <w:jc w:val="left"/>
               <w:rPr/>
             </w:pPr>
             <w:r>
@@ -632,6 +651,7 @@
             <w:pPr>
               <w:pStyle w:val="Normal"/>
               <w:spacing w:before="40" w:after="40"/>
+              <w:jc w:val="left"/>
               <w:rPr/>
             </w:pPr>
             <w:r>
@@ -728,10 +748,8 @@
     </w:p>
     <w:p>
       <w:pPr>
-        <w:pStyle w:val="Normal"/>
-        <w:spacing w:before="0" w:after="280"/>
+        <w:spacing w:after="280"/>
         <w:jc w:val="center"/>
-        <w:rPr/>
       </w:pPr>
       <w:r>
         <w:rPr>
@@ -743,14 +761,11 @@
     </w:p>
     <w:p>
       <w:pPr>
-        <w:pStyle w:val="Normal"/>
         <w:tabs>
-          <w:tab w:val="clear" w:pos="420"/>
-          <w:tab w:val="right" w:pos="8617" w:leader="dot"/>
+          <w:tab w:pos="8617" w:val="right" w:leader="dot"/>
         </w:tabs>
-        <w:spacing w:before="0" w:after="60"/>
+        <w:spacing w:after="60"/>
         <w:ind w:left="0"/>
-        <w:rPr/>
       </w:pPr>
       <w:r>
         <w:rPr>
@@ -764,18 +779,15 @@
     </w:p>
     <w:p>
       <w:pPr>
-        <w:pStyle w:val="Normal"/>
         <w:tabs>
-          <w:tab w:val="clear" w:pos="420"/>
-          <w:tab w:val="right" w:pos="8617" w:leader="dot"/>
+          <w:tab w:pos="8617" w:val="right" w:leader="dot"/>
         </w:tabs>
-        <w:spacing w:before="0" w:after="60"/>
+        <w:spacing w:after="60"/>
         <w:ind w:left="340"/>
-        <w:rPr/>
-      </w:pPr>
-      <w:r>
-        <w:rPr>
-          <w:b w:val="false"/>
+      </w:pPr>
+      <w:r>
+        <w:rPr>
+          <w:b w:val="0"/>
           <w:sz w:val="19"/>
         </w:rPr>
         <w:t>1.1 Latar belakang kasus</w:t>
@@ -785,18 +797,15 @@
     </w:p>
     <w:p>
       <w:pPr>
-        <w:pStyle w:val="Normal"/>
         <w:tabs>
-          <w:tab w:val="clear" w:pos="420"/>
-          <w:tab w:val="right" w:pos="8617" w:leader="dot"/>
+          <w:tab w:pos="8617" w:val="right" w:leader="dot"/>
         </w:tabs>
-        <w:spacing w:before="0" w:after="60"/>
+        <w:spacing w:after="60"/>
         <w:ind w:left="340"/>
-        <w:rPr/>
-      </w:pPr>
-      <w:r>
-        <w:rPr>
-          <w:b w:val="false"/>
+      </w:pPr>
+      <w:r>
+        <w:rPr>
+          <w:b w:val="0"/>
           <w:sz w:val="19"/>
         </w:rPr>
         <w:t>1.2 Tujuan tugas</w:t>
@@ -806,18 +815,15 @@
     </w:p>
     <w:p>
       <w:pPr>
-        <w:pStyle w:val="Normal"/>
         <w:tabs>
-          <w:tab w:val="clear" w:pos="420"/>
-          <w:tab w:val="right" w:pos="8617" w:leader="dot"/>
+          <w:tab w:pos="8617" w:val="right" w:leader="dot"/>
         </w:tabs>
-        <w:spacing w:before="0" w:after="60"/>
+        <w:spacing w:after="60"/>
         <w:ind w:left="340"/>
-        <w:rPr/>
-      </w:pPr>
-      <w:r>
-        <w:rPr>
-          <w:b w:val="false"/>
+      </w:pPr>
+      <w:r>
+        <w:rPr>
+          <w:b w:val="0"/>
           <w:sz w:val="19"/>
         </w:rPr>
         <w:t>1.3 Ruang lingkup</w:t>
@@ -827,14 +833,11 @@
     </w:p>
     <w:p>
       <w:pPr>
-        <w:pStyle w:val="Normal"/>
         <w:tabs>
-          <w:tab w:val="clear" w:pos="420"/>
-          <w:tab w:val="right" w:pos="8617" w:leader="dot"/>
+          <w:tab w:pos="8617" w:val="right" w:leader="dot"/>
         </w:tabs>
-        <w:spacing w:before="0" w:after="60"/>
+        <w:spacing w:after="60"/>
         <w:ind w:left="0"/>
-        <w:rPr/>
       </w:pPr>
       <w:r>
         <w:rPr>
@@ -848,14 +851,11 @@
     </w:p>
     <w:p>
       <w:pPr>
-        <w:pStyle w:val="Normal"/>
         <w:tabs>
-          <w:tab w:val="clear" w:pos="420"/>
-          <w:tab w:val="right" w:pos="8617" w:leader="dot"/>
+          <w:tab w:pos="8617" w:val="right" w:leader="dot"/>
         </w:tabs>
-        <w:spacing w:before="0" w:after="60"/>
+        <w:spacing w:after="60"/>
         <w:ind w:left="0"/>
-        <w:rPr/>
       </w:pPr>
       <w:r>
         <w:rPr>
@@ -869,14 +869,11 @@
     </w:p>
     <w:p>
       <w:pPr>
-        <w:pStyle w:val="Normal"/>
         <w:tabs>
-          <w:tab w:val="clear" w:pos="420"/>
-          <w:tab w:val="right" w:pos="8617" w:leader="dot"/>
+          <w:tab w:pos="8617" w:val="right" w:leader="dot"/>
         </w:tabs>
-        <w:spacing w:before="0" w:after="60"/>
+        <w:spacing w:after="60"/>
         <w:ind w:left="0"/>
-        <w:rPr/>
       </w:pPr>
       <w:r>
         <w:rPr>
@@ -890,18 +887,15 @@
     </w:p>
     <w:p>
       <w:pPr>
-        <w:pStyle w:val="Normal"/>
         <w:tabs>
-          <w:tab w:val="clear" w:pos="420"/>
-          <w:tab w:val="right" w:pos="8617" w:leader="dot"/>
+          <w:tab w:pos="8617" w:val="right" w:leader="dot"/>
         </w:tabs>
-        <w:spacing w:before="0" w:after="60"/>
+        <w:spacing w:after="60"/>
         <w:ind w:left="340"/>
-        <w:rPr/>
-      </w:pPr>
-      <w:r>
-        <w:rPr>
-          <w:b w:val="false"/>
+      </w:pPr>
+      <w:r>
+        <w:rPr>
+          <w:b w:val="0"/>
           <w:sz w:val="19"/>
         </w:rPr>
         <w:t>4.1 Langkah 1: Menyiapkan lingkungan dan broker</w:t>
@@ -911,18 +905,15 @@
     </w:p>
     <w:p>
       <w:pPr>
-        <w:pStyle w:val="Normal"/>
         <w:tabs>
-          <w:tab w:val="clear" w:pos="420"/>
-          <w:tab w:val="right" w:pos="8617" w:leader="dot"/>
+          <w:tab w:pos="8617" w:val="right" w:leader="dot"/>
         </w:tabs>
-        <w:spacing w:before="0" w:after="60"/>
+        <w:spacing w:after="60"/>
         <w:ind w:left="340"/>
-        <w:rPr/>
-      </w:pPr>
-      <w:r>
-        <w:rPr>
-          <w:b w:val="false"/>
+      </w:pPr>
+      <w:r>
+        <w:rPr>
+          <w:b w:val="0"/>
           <w:sz w:val="19"/>
         </w:rPr>
         <w:t>4.2 Langkah 2: Menyeragamkan format pesan</w:t>
@@ -932,18 +923,15 @@
     </w:p>
     <w:p>
       <w:pPr>
-        <w:pStyle w:val="Normal"/>
         <w:tabs>
-          <w:tab w:val="clear" w:pos="420"/>
-          <w:tab w:val="right" w:pos="8617" w:leader="dot"/>
+          <w:tab w:pos="8617" w:val="right" w:leader="dot"/>
         </w:tabs>
-        <w:spacing w:before="0" w:after="60"/>
+        <w:spacing w:after="60"/>
         <w:ind w:left="340"/>
-        <w:rPr/>
-      </w:pPr>
-      <w:r>
-        <w:rPr>
-          <w:b w:val="false"/>
+      </w:pPr>
+      <w:r>
+        <w:rPr>
+          <w:b w:val="0"/>
           <w:sz w:val="19"/>
         </w:rPr>
         <w:t>4.3 Langkah 3: Implementasi pipe</w:t>
@@ -953,18 +941,15 @@
     </w:p>
     <w:p>
       <w:pPr>
-        <w:pStyle w:val="Normal"/>
         <w:tabs>
-          <w:tab w:val="clear" w:pos="420"/>
-          <w:tab w:val="right" w:pos="8617" w:leader="dot"/>
+          <w:tab w:pos="8617" w:val="right" w:leader="dot"/>
         </w:tabs>
-        <w:spacing w:before="0" w:after="60"/>
+        <w:spacing w:after="60"/>
         <w:ind w:left="340"/>
-        <w:rPr/>
-      </w:pPr>
-      <w:r>
-        <w:rPr>
-          <w:b w:val="false"/>
+      </w:pPr>
+      <w:r>
+        <w:rPr>
+          <w:b w:val="0"/>
           <w:sz w:val="19"/>
         </w:rPr>
         <w:t>4.4 Langkah 4: Implementasi message queue</w:t>
@@ -974,18 +959,15 @@
     </w:p>
     <w:p>
       <w:pPr>
-        <w:pStyle w:val="Normal"/>
         <w:tabs>
-          <w:tab w:val="clear" w:pos="420"/>
-          <w:tab w:val="right" w:pos="8617" w:leader="dot"/>
+          <w:tab w:pos="8617" w:val="right" w:leader="dot"/>
         </w:tabs>
-        <w:spacing w:before="0" w:after="60"/>
+        <w:spacing w:after="60"/>
         <w:ind w:left="340"/>
-        <w:rPr/>
-      </w:pPr>
-      <w:r>
-        <w:rPr>
-          <w:b w:val="false"/>
+      </w:pPr>
+      <w:r>
+        <w:rPr>
+          <w:b w:val="0"/>
           <w:sz w:val="19"/>
         </w:rPr>
         <w:t>4.5 Langkah 5: Implementasi publish-subscribe dengan MQTT</w:t>
@@ -995,18 +977,15 @@
     </w:p>
     <w:p>
       <w:pPr>
-        <w:pStyle w:val="Normal"/>
         <w:tabs>
-          <w:tab w:val="clear" w:pos="420"/>
-          <w:tab w:val="right" w:pos="8617" w:leader="dot"/>
+          <w:tab w:pos="8617" w:val="right" w:leader="dot"/>
         </w:tabs>
-        <w:spacing w:before="0" w:after="60"/>
+        <w:spacing w:after="60"/>
         <w:ind w:left="340"/>
-        <w:rPr/>
-      </w:pPr>
-      <w:r>
-        <w:rPr>
-          <w:b w:val="false"/>
+      </w:pPr>
+      <w:r>
+        <w:rPr>
+          <w:b w:val="0"/>
           <w:sz w:val="19"/>
         </w:rPr>
         <w:t>4.6 Langkah 6: Pengukuran dan pemeriksaan</w:t>
@@ -1016,14 +995,11 @@
     </w:p>
     <w:p>
       <w:pPr>
-        <w:pStyle w:val="Normal"/>
         <w:tabs>
-          <w:tab w:val="clear" w:pos="420"/>
-          <w:tab w:val="right" w:pos="8617" w:leader="dot"/>
+          <w:tab w:pos="8617" w:val="right" w:leader="dot"/>
         </w:tabs>
-        <w:spacing w:before="0" w:after="60"/>
+        <w:spacing w:after="60"/>
         <w:ind w:left="0"/>
-        <w:rPr/>
       </w:pPr>
       <w:r>
         <w:rPr>
@@ -1037,18 +1013,15 @@
     </w:p>
     <w:p>
       <w:pPr>
-        <w:pStyle w:val="Normal"/>
         <w:tabs>
-          <w:tab w:val="clear" w:pos="420"/>
-          <w:tab w:val="right" w:pos="8617" w:leader="dot"/>
+          <w:tab w:pos="8617" w:val="right" w:leader="dot"/>
         </w:tabs>
-        <w:spacing w:before="0" w:after="60"/>
+        <w:spacing w:after="60"/>
         <w:ind w:left="340"/>
-        <w:rPr/>
-      </w:pPr>
-      <w:r>
-        <w:rPr>
-          <w:b w:val="false"/>
+      </w:pPr>
+      <w:r>
+        <w:rPr>
+          <w:b w:val="0"/>
           <w:sz w:val="19"/>
         </w:rPr>
         <w:t>5.1 Hasil</w:t>
@@ -1058,18 +1031,15 @@
     </w:p>
     <w:p>
       <w:pPr>
-        <w:pStyle w:val="Normal"/>
         <w:tabs>
-          <w:tab w:val="clear" w:pos="420"/>
-          <w:tab w:val="right" w:pos="8617" w:leader="dot"/>
+          <w:tab w:pos="8617" w:val="right" w:leader="dot"/>
         </w:tabs>
-        <w:spacing w:before="0" w:after="60"/>
+        <w:spacing w:after="60"/>
         <w:ind w:left="340"/>
-        <w:rPr/>
-      </w:pPr>
-      <w:r>
-        <w:rPr>
-          <w:b w:val="false"/>
+      </w:pPr>
+      <w:r>
+        <w:rPr>
+          <w:b w:val="0"/>
           <w:sz w:val="19"/>
         </w:rPr>
         <w:t>5.2 Analisis</w:t>
@@ -1079,18 +1049,15 @@
     </w:p>
     <w:p>
       <w:pPr>
-        <w:pStyle w:val="Normal"/>
         <w:tabs>
-          <w:tab w:val="clear" w:pos="420"/>
-          <w:tab w:val="right" w:pos="8617" w:leader="dot"/>
+          <w:tab w:pos="8617" w:val="right" w:leader="dot"/>
         </w:tabs>
-        <w:spacing w:before="0" w:after="60"/>
+        <w:spacing w:after="60"/>
         <w:ind w:left="340"/>
-        <w:rPr/>
-      </w:pPr>
-      <w:r>
-        <w:rPr>
-          <w:b w:val="false"/>
+      </w:pPr>
+      <w:r>
+        <w:rPr>
+          <w:b w:val="0"/>
           <w:sz w:val="19"/>
         </w:rPr>
         <w:t>5.3 Rekomendasi</w:t>
@@ -1100,14 +1067,11 @@
     </w:p>
     <w:p>
       <w:pPr>
-        <w:pStyle w:val="Normal"/>
         <w:tabs>
-          <w:tab w:val="clear" w:pos="420"/>
-          <w:tab w:val="right" w:pos="8617" w:leader="dot"/>
+          <w:tab w:pos="8617" w:val="right" w:leader="dot"/>
         </w:tabs>
-        <w:spacing w:before="0" w:after="60"/>
+        <w:spacing w:after="60"/>
         <w:ind w:left="0"/>
-        <w:rPr/>
       </w:pPr>
       <w:r>
         <w:rPr>
@@ -1121,14 +1085,11 @@
     </w:p>
     <w:p>
       <w:pPr>
-        <w:pStyle w:val="Normal"/>
         <w:tabs>
-          <w:tab w:val="clear" w:pos="420"/>
-          <w:tab w:val="right" w:pos="8617" w:leader="dot"/>
+          <w:tab w:pos="8617" w:val="right" w:leader="dot"/>
         </w:tabs>
-        <w:spacing w:before="0" w:after="60"/>
+        <w:spacing w:after="60"/>
         <w:ind w:left="0"/>
-        <w:rPr/>
       </w:pPr>
       <w:r>
         <w:rPr>
@@ -1142,14 +1103,11 @@
     </w:p>
     <w:p>
       <w:pPr>
-        <w:pStyle w:val="Normal"/>
         <w:tabs>
-          <w:tab w:val="clear" w:pos="420"/>
-          <w:tab w:val="right" w:pos="8617" w:leader="dot"/>
+          <w:tab w:pos="8617" w:val="right" w:leader="dot"/>
         </w:tabs>
-        <w:spacing w:before="0" w:after="60"/>
+        <w:spacing w:after="60"/>
         <w:ind w:left="0"/>
-        <w:rPr/>
       </w:pPr>
       <w:r>
         <w:rPr>
@@ -1163,14 +1121,11 @@
     </w:p>
     <w:p>
       <w:pPr>
-        <w:pStyle w:val="Normal"/>
         <w:tabs>
-          <w:tab w:val="clear" w:pos="420"/>
-          <w:tab w:val="right" w:pos="8617" w:leader="dot"/>
+          <w:tab w:pos="8617" w:val="right" w:leader="dot"/>
         </w:tabs>
-        <w:spacing w:before="0" w:after="60"/>
+        <w:spacing w:after="60"/>
         <w:ind w:left="0"/>
-        <w:rPr/>
       </w:pPr>
       <w:r>
         <w:rPr>
@@ -1184,14 +1139,11 @@
     </w:p>
     <w:p>
       <w:pPr>
-        <w:pStyle w:val="Normal"/>
         <w:tabs>
-          <w:tab w:val="clear" w:pos="420"/>
-          <w:tab w:val="right" w:pos="8617" w:leader="dot"/>
+          <w:tab w:pos="8617" w:val="right" w:leader="dot"/>
         </w:tabs>
-        <w:spacing w:before="0" w:after="60"/>
+        <w:spacing w:after="60"/>
         <w:ind w:left="0"/>
-        <w:rPr/>
       </w:pPr>
       <w:r>
         <w:rPr>
@@ -1205,14 +1157,11 @@
     </w:p>
     <w:p>
       <w:pPr>
-        <w:pStyle w:val="Normal"/>
         <w:tabs>
-          <w:tab w:val="clear" w:pos="420"/>
-          <w:tab w:val="right" w:pos="8617" w:leader="dot"/>
+          <w:tab w:pos="8617" w:val="right" w:leader="dot"/>
         </w:tabs>
-        <w:spacing w:before="0" w:after="60"/>
+        <w:spacing w:after="60"/>
         <w:ind w:left="0"/>
-        <w:rPr/>
       </w:pPr>
       <w:r>
         <w:rPr>
@@ -1226,18 +1175,15 @@
     </w:p>
     <w:p>
       <w:pPr>
-        <w:pStyle w:val="Normal"/>
         <w:tabs>
-          <w:tab w:val="clear" w:pos="420"/>
-          <w:tab w:val="right" w:pos="8617" w:leader="dot"/>
+          <w:tab w:pos="8617" w:val="right" w:leader="dot"/>
         </w:tabs>
-        <w:spacing w:before="0" w:after="60"/>
+        <w:spacing w:after="60"/>
         <w:ind w:left="340"/>
-        <w:rPr/>
-      </w:pPr>
-      <w:r>
-        <w:rPr>
-          <w:b w:val="false"/>
+      </w:pPr>
+      <w:r>
+        <w:rPr>
+          <w:b w:val="0"/>
           <w:sz w:val="19"/>
         </w:rPr>
         <w:t>Swa-nilai berdasarkan kriteria lembar tugas</w:t>
@@ -1247,14 +1193,11 @@
     </w:p>
     <w:p>
       <w:pPr>
-        <w:pStyle w:val="Normal"/>
         <w:tabs>
-          <w:tab w:val="clear" w:pos="420"/>
-          <w:tab w:val="right" w:pos="8617" w:leader="dot"/>
+          <w:tab w:pos="8617" w:val="right" w:leader="dot"/>
         </w:tabs>
-        <w:spacing w:before="0" w:after="60"/>
+        <w:spacing w:after="60"/>
         <w:ind w:left="0"/>
-        <w:rPr/>
       </w:pPr>
       <w:r>
         <w:rPr>
@@ -1267,27 +1210,11 @@
       </w:r>
     </w:p>
     <w:p>
-      <w:pPr>
-        <w:pStyle w:val="Normal"/>
-        <w:rPr/>
-      </w:pPr>
-      <w:r>
-        <w:rPr/>
-      </w:r>
       <w:r>
         <w:br w:type="page"/>
       </w:r>
     </w:p>
-    <w:p>
-      <w:pPr>
-        <w:pStyle w:val="Normal"/>
-        <w:spacing w:before="0" w:after="0"/>
-        <w:rPr/>
-      </w:pPr>
-      <w:r>
-        <w:rPr/>
-      </w:r>
-    </w:p>
+    <w:p/>
     <w:p>
       <w:pPr>
         <w:pStyle w:val="Heading1"/>
@@ -1652,6 +1579,7 @@
             <w:pPr>
               <w:pStyle w:val="Normal"/>
               <w:spacing w:before="40" w:after="40"/>
+              <w:jc w:val="left"/>
               <w:rPr/>
             </w:pPr>
             <w:r>
@@ -1678,6 +1606,7 @@
             <w:pPr>
               <w:pStyle w:val="Normal"/>
               <w:spacing w:before="40" w:after="40"/>
+              <w:jc w:val="left"/>
               <w:rPr/>
             </w:pPr>
             <w:r>
@@ -1708,6 +1637,7 @@
             <w:pPr>
               <w:pStyle w:val="Normal"/>
               <w:spacing w:before="40" w:after="40"/>
+              <w:jc w:val="left"/>
               <w:rPr/>
             </w:pPr>
             <w:r>
@@ -1732,6 +1662,7 @@
             <w:pPr>
               <w:pStyle w:val="Normal"/>
               <w:spacing w:before="40" w:after="40"/>
+              <w:jc w:val="left"/>
               <w:rPr/>
             </w:pPr>
             <w:r>
@@ -1773,6 +1704,7 @@
             <w:pPr>
               <w:pStyle w:val="Normal"/>
               <w:spacing w:before="40" w:after="40"/>
+              <w:jc w:val="left"/>
               <w:rPr/>
             </w:pPr>
             <w:r>
@@ -1797,6 +1729,7 @@
             <w:pPr>
               <w:pStyle w:val="Normal"/>
               <w:spacing w:before="40" w:after="40"/>
+              <w:jc w:val="left"/>
               <w:rPr/>
             </w:pPr>
             <w:r>
@@ -1826,6 +1759,7 @@
             <w:pPr>
               <w:pStyle w:val="Normal"/>
               <w:spacing w:before="40" w:after="40"/>
+              <w:jc w:val="left"/>
               <w:rPr/>
             </w:pPr>
             <w:r>
@@ -1850,6 +1784,7 @@
             <w:pPr>
               <w:pStyle w:val="Normal"/>
               <w:spacing w:before="40" w:after="40"/>
+              <w:jc w:val="left"/>
               <w:rPr/>
             </w:pPr>
             <w:r>
@@ -1879,6 +1814,7 @@
             <w:pPr>
               <w:pStyle w:val="Normal"/>
               <w:spacing w:before="40" w:after="40"/>
+              <w:jc w:val="left"/>
               <w:rPr/>
             </w:pPr>
             <w:r>
@@ -1903,6 +1839,7 @@
             <w:pPr>
               <w:pStyle w:val="Normal"/>
               <w:spacing w:before="40" w:after="40"/>
+              <w:jc w:val="left"/>
               <w:rPr/>
             </w:pPr>
             <w:r>
@@ -1932,6 +1869,7 @@
             <w:pPr>
               <w:pStyle w:val="Normal"/>
               <w:spacing w:before="40" w:after="40"/>
+              <w:jc w:val="left"/>
               <w:rPr/>
             </w:pPr>
             <w:r>
@@ -1956,6 +1894,7 @@
             <w:pPr>
               <w:pStyle w:val="Normal"/>
               <w:spacing w:before="40" w:after="40"/>
+              <w:jc w:val="left"/>
               <w:rPr/>
             </w:pPr>
             <w:r>
@@ -1985,6 +1924,7 @@
             <w:pPr>
               <w:pStyle w:val="Normal"/>
               <w:spacing w:before="40" w:after="40"/>
+              <w:jc w:val="left"/>
               <w:rPr/>
             </w:pPr>
             <w:r>
@@ -2009,6 +1949,7 @@
             <w:pPr>
               <w:pStyle w:val="Normal"/>
               <w:spacing w:before="40" w:after="40"/>
+              <w:jc w:val="left"/>
               <w:rPr/>
             </w:pPr>
             <w:r>
@@ -3501,6 +3442,7 @@
             <w:pPr>
               <w:pStyle w:val="Normal"/>
               <w:spacing w:before="40" w:after="40"/>
+              <w:jc w:val="left"/>
               <w:rPr/>
             </w:pPr>
             <w:r>
@@ -3527,6 +3469,7 @@
             <w:pPr>
               <w:pStyle w:val="Normal"/>
               <w:spacing w:before="40" w:after="40"/>
+              <w:jc w:val="left"/>
               <w:rPr/>
             </w:pPr>
             <w:r>
@@ -3553,6 +3496,7 @@
             <w:pPr>
               <w:pStyle w:val="Normal"/>
               <w:spacing w:before="40" w:after="40"/>
+              <w:jc w:val="left"/>
               <w:rPr/>
             </w:pPr>
             <w:r>
@@ -3579,6 +3523,7 @@
             <w:pPr>
               <w:pStyle w:val="Normal"/>
               <w:spacing w:before="40" w:after="40"/>
+              <w:jc w:val="left"/>
               <w:rPr/>
             </w:pPr>
             <w:r>
@@ -3605,6 +3550,7 @@
             <w:pPr>
               <w:pStyle w:val="Normal"/>
               <w:spacing w:before="40" w:after="40"/>
+              <w:jc w:val="left"/>
               <w:rPr/>
             </w:pPr>
             <w:r>
@@ -3631,6 +3577,7 @@
             <w:pPr>
               <w:pStyle w:val="Normal"/>
               <w:spacing w:before="40" w:after="40"/>
+              <w:jc w:val="left"/>
               <w:rPr/>
             </w:pPr>
             <w:r>
@@ -3657,6 +3604,7 @@
             <w:pPr>
               <w:pStyle w:val="Normal"/>
               <w:spacing w:before="40" w:after="40"/>
+              <w:jc w:val="left"/>
               <w:rPr/>
             </w:pPr>
             <w:r>
@@ -3683,6 +3631,7 @@
             <w:pPr>
               <w:pStyle w:val="Normal"/>
               <w:spacing w:before="40" w:after="40"/>
+              <w:jc w:val="left"/>
               <w:rPr/>
             </w:pPr>
             <w:r>
@@ -3713,6 +3662,7 @@
             <w:pPr>
               <w:pStyle w:val="Normal"/>
               <w:spacing w:before="40" w:after="40"/>
+              <w:jc w:val="left"/>
               <w:rPr/>
             </w:pPr>
             <w:r>
@@ -3737,6 +3687,7 @@
             <w:pPr>
               <w:pStyle w:val="Normal"/>
               <w:spacing w:before="40" w:after="40"/>
+              <w:jc w:val="left"/>
               <w:rPr/>
             </w:pPr>
             <w:r>
@@ -3761,6 +3712,7 @@
             <w:pPr>
               <w:pStyle w:val="Normal"/>
               <w:spacing w:before="40" w:after="40"/>
+              <w:jc w:val="left"/>
               <w:rPr/>
             </w:pPr>
             <w:r>
@@ -3785,6 +3737,7 @@
             <w:pPr>
               <w:pStyle w:val="Normal"/>
               <w:spacing w:before="40" w:after="40"/>
+              <w:jc w:val="left"/>
               <w:rPr/>
             </w:pPr>
             <w:r>
@@ -3809,6 +3762,7 @@
             <w:pPr>
               <w:pStyle w:val="Normal"/>
               <w:spacing w:before="40" w:after="40"/>
+              <w:jc w:val="left"/>
               <w:rPr/>
             </w:pPr>
             <w:r>
@@ -3833,6 +3787,7 @@
             <w:pPr>
               <w:pStyle w:val="Normal"/>
               <w:spacing w:before="40" w:after="40"/>
+              <w:jc w:val="left"/>
               <w:rPr/>
             </w:pPr>
             <w:r>
@@ -3857,6 +3812,7 @@
             <w:pPr>
               <w:pStyle w:val="Normal"/>
               <w:spacing w:before="40" w:after="40"/>
+              <w:jc w:val="left"/>
               <w:rPr/>
             </w:pPr>
             <w:r>
@@ -3881,6 +3837,7 @@
             <w:pPr>
               <w:pStyle w:val="Normal"/>
               <w:spacing w:before="40" w:after="40"/>
+              <w:jc w:val="left"/>
               <w:rPr/>
             </w:pPr>
             <w:r>
@@ -3910,6 +3867,7 @@
             <w:pPr>
               <w:pStyle w:val="Normal"/>
               <w:spacing w:before="40" w:after="40"/>
+              <w:jc w:val="left"/>
               <w:rPr/>
             </w:pPr>
             <w:r>
@@ -3934,6 +3892,7 @@
             <w:pPr>
               <w:pStyle w:val="Normal"/>
               <w:spacing w:before="40" w:after="40"/>
+              <w:jc w:val="left"/>
               <w:rPr/>
             </w:pPr>
             <w:r>
@@ -3958,6 +3917,7 @@
             <w:pPr>
               <w:pStyle w:val="Normal"/>
               <w:spacing w:before="40" w:after="40"/>
+              <w:jc w:val="left"/>
               <w:rPr/>
             </w:pPr>
             <w:r>
@@ -3982,6 +3942,7 @@
             <w:pPr>
               <w:pStyle w:val="Normal"/>
               <w:spacing w:before="40" w:after="40"/>
+              <w:jc w:val="left"/>
               <w:rPr/>
             </w:pPr>
             <w:r>
@@ -4006,6 +3967,7 @@
             <w:pPr>
               <w:pStyle w:val="Normal"/>
               <w:spacing w:before="40" w:after="40"/>
+              <w:jc w:val="left"/>
               <w:rPr/>
             </w:pPr>
             <w:r>
@@ -4030,6 +3992,7 @@
             <w:pPr>
               <w:pStyle w:val="Normal"/>
               <w:spacing w:before="40" w:after="40"/>
+              <w:jc w:val="left"/>
               <w:rPr/>
             </w:pPr>
             <w:r>
@@ -4054,6 +4017,7 @@
             <w:pPr>
               <w:pStyle w:val="Normal"/>
               <w:spacing w:before="40" w:after="40"/>
+              <w:jc w:val="left"/>
               <w:rPr/>
             </w:pPr>
             <w:r>
@@ -4078,6 +4042,7 @@
             <w:pPr>
               <w:pStyle w:val="Normal"/>
               <w:spacing w:before="40" w:after="40"/>
+              <w:jc w:val="left"/>
               <w:rPr/>
             </w:pPr>
             <w:r>
@@ -4107,6 +4072,7 @@
             <w:pPr>
               <w:pStyle w:val="Normal"/>
               <w:spacing w:before="40" w:after="40"/>
+              <w:jc w:val="left"/>
               <w:rPr/>
             </w:pPr>
             <w:r>
@@ -4131,6 +4097,7 @@
             <w:pPr>
               <w:pStyle w:val="Normal"/>
               <w:spacing w:before="40" w:after="40"/>
+              <w:jc w:val="left"/>
               <w:rPr/>
             </w:pPr>
             <w:r>
@@ -4155,6 +4122,7 @@
             <w:pPr>
               <w:pStyle w:val="Normal"/>
               <w:spacing w:before="40" w:after="40"/>
+              <w:jc w:val="left"/>
               <w:rPr/>
             </w:pPr>
             <w:r>
@@ -4179,6 +4147,7 @@
             <w:pPr>
               <w:pStyle w:val="Normal"/>
               <w:spacing w:before="40" w:after="40"/>
+              <w:jc w:val="left"/>
               <w:rPr/>
             </w:pPr>
             <w:r>
@@ -4203,6 +4172,7 @@
             <w:pPr>
               <w:pStyle w:val="Normal"/>
               <w:spacing w:before="40" w:after="40"/>
+              <w:jc w:val="left"/>
               <w:rPr/>
             </w:pPr>
             <w:r>
@@ -4227,6 +4197,7 @@
             <w:pPr>
               <w:pStyle w:val="Normal"/>
               <w:spacing w:before="40" w:after="40"/>
+              <w:jc w:val="left"/>
               <w:rPr/>
             </w:pPr>
             <w:r>
@@ -4251,6 +4222,7 @@
             <w:pPr>
               <w:pStyle w:val="Normal"/>
               <w:spacing w:before="40" w:after="40"/>
+              <w:jc w:val="left"/>
               <w:rPr/>
             </w:pPr>
             <w:r>
@@ -4275,6 +4247,7 @@
             <w:pPr>
               <w:pStyle w:val="Normal"/>
               <w:spacing w:before="40" w:after="40"/>
+              <w:jc w:val="left"/>
               <w:rPr/>
             </w:pPr>
             <w:r>
@@ -4429,6 +4402,7 @@
             <w:pPr>
               <w:pStyle w:val="Normal"/>
               <w:spacing w:before="40" w:after="40"/>
+              <w:jc w:val="left"/>
               <w:rPr/>
             </w:pPr>
             <w:r>
@@ -4455,6 +4429,7 @@
             <w:pPr>
               <w:pStyle w:val="Normal"/>
               <w:spacing w:before="40" w:after="40"/>
+              <w:jc w:val="left"/>
               <w:rPr/>
             </w:pPr>
             <w:r>
@@ -4481,6 +4456,7 @@
             <w:pPr>
               <w:pStyle w:val="Normal"/>
               <w:spacing w:before="40" w:after="40"/>
+              <w:jc w:val="left"/>
               <w:rPr/>
             </w:pPr>
             <w:r>
@@ -4507,6 +4483,7 @@
             <w:pPr>
               <w:pStyle w:val="Normal"/>
               <w:spacing w:before="40" w:after="40"/>
+              <w:jc w:val="left"/>
               <w:rPr/>
             </w:pPr>
             <w:r>
@@ -4537,6 +4514,7 @@
             <w:pPr>
               <w:pStyle w:val="Normal"/>
               <w:spacing w:before="40" w:after="40"/>
+              <w:jc w:val="left"/>
               <w:rPr/>
             </w:pPr>
             <w:r>
@@ -4561,6 +4539,7 @@
             <w:pPr>
               <w:pStyle w:val="Normal"/>
               <w:spacing w:before="40" w:after="40"/>
+              <w:jc w:val="left"/>
               <w:rPr/>
             </w:pPr>
             <w:r>
@@ -4585,6 +4564,7 @@
             <w:pPr>
               <w:pStyle w:val="Normal"/>
               <w:spacing w:before="40" w:after="40"/>
+              <w:jc w:val="left"/>
               <w:rPr/>
             </w:pPr>
             <w:r>
@@ -4609,6 +4589,7 @@
             <w:pPr>
               <w:pStyle w:val="Normal"/>
               <w:spacing w:before="40" w:after="40"/>
+              <w:jc w:val="left"/>
               <w:rPr/>
             </w:pPr>
             <w:r>
@@ -4638,6 +4619,7 @@
             <w:pPr>
               <w:pStyle w:val="Normal"/>
               <w:spacing w:before="40" w:after="40"/>
+              <w:jc w:val="left"/>
               <w:rPr/>
             </w:pPr>
             <w:r>
@@ -4662,6 +4644,7 @@
             <w:pPr>
               <w:pStyle w:val="Normal"/>
               <w:spacing w:before="40" w:after="40"/>
+              <w:jc w:val="left"/>
               <w:rPr/>
             </w:pPr>
             <w:r>
@@ -4686,6 +4669,7 @@
             <w:pPr>
               <w:pStyle w:val="Normal"/>
               <w:spacing w:before="40" w:after="40"/>
+              <w:jc w:val="left"/>
               <w:rPr/>
             </w:pPr>
             <w:r>
@@ -4710,6 +4694,7 @@
             <w:pPr>
               <w:pStyle w:val="Normal"/>
               <w:spacing w:before="40" w:after="40"/>
+              <w:jc w:val="left"/>
               <w:rPr/>
             </w:pPr>
             <w:r>
@@ -5036,6 +5021,7 @@
             <w:pPr>
               <w:pStyle w:val="Normal"/>
               <w:spacing w:before="40" w:after="40"/>
+              <w:jc w:val="left"/>
               <w:rPr/>
             </w:pPr>
             <w:r>
@@ -5062,6 +5048,7 @@
             <w:pPr>
               <w:pStyle w:val="Normal"/>
               <w:spacing w:before="40" w:after="40"/>
+              <w:jc w:val="left"/>
               <w:rPr/>
             </w:pPr>
             <w:r>
@@ -5092,6 +5079,7 @@
             <w:pPr>
               <w:pStyle w:val="Normal"/>
               <w:spacing w:before="40" w:after="40"/>
+              <w:jc w:val="left"/>
               <w:rPr/>
             </w:pPr>
             <w:r>
@@ -5116,6 +5104,7 @@
             <w:pPr>
               <w:pStyle w:val="Normal"/>
               <w:spacing w:before="40" w:after="40"/>
+              <w:jc w:val="left"/>
               <w:rPr/>
             </w:pPr>
             <w:r>
@@ -5145,6 +5134,7 @@
             <w:pPr>
               <w:pStyle w:val="Normal"/>
               <w:spacing w:before="40" w:after="40"/>
+              <w:jc w:val="left"/>
               <w:rPr/>
             </w:pPr>
             <w:r>
@@ -5169,6 +5159,7 @@
             <w:pPr>
               <w:pStyle w:val="Normal"/>
               <w:spacing w:before="40" w:after="40"/>
+              <w:jc w:val="left"/>
               <w:rPr/>
             </w:pPr>
             <w:r>
@@ -5198,6 +5189,7 @@
             <w:pPr>
               <w:pStyle w:val="Normal"/>
               <w:spacing w:before="40" w:after="40"/>
+              <w:jc w:val="left"/>
               <w:rPr/>
             </w:pPr>
             <w:r>
@@ -5222,6 +5214,7 @@
             <w:pPr>
               <w:pStyle w:val="Normal"/>
               <w:spacing w:before="40" w:after="40"/>
+              <w:jc w:val="left"/>
               <w:rPr/>
             </w:pPr>
             <w:r>
@@ -5251,6 +5244,7 @@
             <w:pPr>
               <w:pStyle w:val="Normal"/>
               <w:spacing w:before="40" w:after="40"/>
+              <w:jc w:val="left"/>
               <w:rPr/>
             </w:pPr>
             <w:r>
@@ -5275,6 +5269,7 @@
             <w:pPr>
               <w:pStyle w:val="Normal"/>
               <w:spacing w:before="40" w:after="40"/>
+              <w:jc w:val="left"/>
               <w:rPr/>
             </w:pPr>
             <w:r>
@@ -6705,6 +6700,7 @@
             <w:pPr>
               <w:pStyle w:val="Normal"/>
               <w:spacing w:before="40" w:after="40"/>
+              <w:jc w:val="left"/>
               <w:rPr/>
             </w:pPr>
             <w:r>
@@ -6731,6 +6727,7 @@
             <w:pPr>
               <w:pStyle w:val="Normal"/>
               <w:spacing w:before="40" w:after="40"/>
+              <w:jc w:val="left"/>
               <w:rPr/>
             </w:pPr>
             <w:r>
@@ -6757,6 +6754,7 @@
             <w:pPr>
               <w:pStyle w:val="Normal"/>
               <w:spacing w:before="40" w:after="40"/>
+              <w:jc w:val="left"/>
               <w:rPr/>
             </w:pPr>
             <w:r>
@@ -6783,6 +6781,7 @@
             <w:pPr>
               <w:pStyle w:val="Normal"/>
               <w:spacing w:before="40" w:after="40"/>
+              <w:jc w:val="left"/>
               <w:rPr/>
             </w:pPr>
             <w:r>
@@ -6813,6 +6812,7 @@
             <w:pPr>
               <w:pStyle w:val="Normal"/>
               <w:spacing w:before="40" w:after="40"/>
+              <w:jc w:val="left"/>
               <w:rPr/>
             </w:pPr>
             <w:r>
@@ -6837,6 +6837,7 @@
             <w:pPr>
               <w:pStyle w:val="Normal"/>
               <w:spacing w:before="40" w:after="40"/>
+              <w:jc w:val="left"/>
               <w:rPr/>
             </w:pPr>
             <w:r>
@@ -6861,6 +6862,7 @@
             <w:pPr>
               <w:pStyle w:val="Normal"/>
               <w:spacing w:before="40" w:after="40"/>
+              <w:jc w:val="left"/>
               <w:rPr/>
             </w:pPr>
             <w:r>
@@ -6885,6 +6887,7 @@
             <w:pPr>
               <w:pStyle w:val="Normal"/>
               <w:spacing w:before="40" w:after="40"/>
+              <w:jc w:val="left"/>
               <w:rPr/>
             </w:pPr>
             <w:r>
@@ -7112,6 +7115,7 @@
             <w:pPr>
               <w:pStyle w:val="Normal"/>
               <w:spacing w:before="40" w:after="40"/>
+              <w:jc w:val="left"/>
               <w:rPr/>
             </w:pPr>
             <w:r>
@@ -7138,6 +7142,7 @@
             <w:pPr>
               <w:pStyle w:val="Normal"/>
               <w:spacing w:before="40" w:after="40"/>
+              <w:jc w:val="left"/>
               <w:rPr/>
             </w:pPr>
             <w:r>
@@ -7164,6 +7169,7 @@
             <w:pPr>
               <w:pStyle w:val="Normal"/>
               <w:spacing w:before="40" w:after="40"/>
+              <w:jc w:val="left"/>
               <w:rPr/>
             </w:pPr>
             <w:r>
@@ -7194,6 +7200,7 @@
             <w:pPr>
               <w:pStyle w:val="Normal"/>
               <w:spacing w:before="40" w:after="40"/>
+              <w:jc w:val="left"/>
               <w:rPr/>
             </w:pPr>
             <w:r>
@@ -7218,6 +7225,7 @@
             <w:pPr>
               <w:pStyle w:val="Normal"/>
               <w:spacing w:before="40" w:after="40"/>
+              <w:jc w:val="left"/>
               <w:rPr/>
             </w:pPr>
             <w:r>
@@ -7242,6 +7250,7 @@
             <w:pPr>
               <w:pStyle w:val="Normal"/>
               <w:spacing w:before="40" w:after="40"/>
+              <w:jc w:val="left"/>
               <w:rPr/>
             </w:pPr>
             <w:r>
@@ -7271,6 +7280,7 @@
             <w:pPr>
               <w:pStyle w:val="Normal"/>
               <w:spacing w:before="40" w:after="40"/>
+              <w:jc w:val="left"/>
               <w:rPr/>
             </w:pPr>
             <w:r>
@@ -7295,6 +7305,7 @@
             <w:pPr>
               <w:pStyle w:val="Normal"/>
               <w:spacing w:before="40" w:after="40"/>
+              <w:jc w:val="left"/>
               <w:rPr/>
             </w:pPr>
             <w:r>
@@ -7319,6 +7330,7 @@
             <w:pPr>
               <w:pStyle w:val="Normal"/>
               <w:spacing w:before="40" w:after="40"/>
+              <w:jc w:val="left"/>
               <w:rPr/>
             </w:pPr>
             <w:r>
@@ -7348,6 +7360,7 @@
             <w:pPr>
               <w:pStyle w:val="Normal"/>
               <w:spacing w:before="40" w:after="40"/>
+              <w:jc w:val="left"/>
               <w:rPr/>
             </w:pPr>
             <w:r>
@@ -7372,6 +7385,7 @@
             <w:pPr>
               <w:pStyle w:val="Normal"/>
               <w:spacing w:before="40" w:after="40"/>
+              <w:jc w:val="left"/>
               <w:rPr/>
             </w:pPr>
             <w:r>
@@ -7396,6 +7410,7 @@
             <w:pPr>
               <w:pStyle w:val="Normal"/>
               <w:spacing w:before="40" w:after="40"/>
+              <w:jc w:val="left"/>
               <w:rPr/>
             </w:pPr>
             <w:r>
@@ -7425,6 +7440,7 @@
             <w:pPr>
               <w:pStyle w:val="Normal"/>
               <w:spacing w:before="40" w:after="40"/>
+              <w:jc w:val="left"/>
               <w:rPr/>
             </w:pPr>
             <w:r>
@@ -7449,6 +7465,7 @@
             <w:pPr>
               <w:pStyle w:val="Normal"/>
               <w:spacing w:before="40" w:after="40"/>
+              <w:jc w:val="left"/>
               <w:rPr/>
             </w:pPr>
             <w:r>
@@ -7473,6 +7490,7 @@
             <w:pPr>
               <w:pStyle w:val="Normal"/>
               <w:spacing w:before="40" w:after="40"/>
+              <w:jc w:val="left"/>
               <w:rPr/>
             </w:pPr>
             <w:r>
@@ -7561,6 +7579,7 @@
             <w:pPr>
               <w:pStyle w:val="Normal"/>
               <w:spacing w:before="40" w:after="40"/>
+              <w:jc w:val="left"/>
               <w:rPr/>
             </w:pPr>
             <w:r>
@@ -7587,6 +7606,7 @@
             <w:pPr>
               <w:pStyle w:val="Normal"/>
               <w:spacing w:before="40" w:after="40"/>
+              <w:jc w:val="left"/>
               <w:rPr/>
             </w:pPr>
             <w:r>
@@ -7613,6 +7633,7 @@
             <w:pPr>
               <w:pStyle w:val="Normal"/>
               <w:spacing w:before="40" w:after="40"/>
+              <w:jc w:val="left"/>
               <w:rPr/>
             </w:pPr>
             <w:r>
@@ -7643,6 +7664,7 @@
             <w:pPr>
               <w:pStyle w:val="Normal"/>
               <w:spacing w:before="40" w:after="40"/>
+              <w:jc w:val="left"/>
               <w:rPr/>
             </w:pPr>
             <w:r>
@@ -7667,6 +7689,7 @@
             <w:pPr>
               <w:pStyle w:val="Normal"/>
               <w:spacing w:before="40" w:after="40"/>
+              <w:jc w:val="left"/>
               <w:rPr/>
             </w:pPr>
             <w:r>
@@ -7691,6 +7714,7 @@
             <w:pPr>
               <w:pStyle w:val="Normal"/>
               <w:spacing w:before="40" w:after="40"/>
+              <w:jc w:val="left"/>
               <w:rPr/>
             </w:pPr>
             <w:r>
@@ -7720,6 +7744,7 @@
             <w:pPr>
               <w:pStyle w:val="Normal"/>
               <w:spacing w:before="40" w:after="40"/>
+              <w:jc w:val="left"/>
               <w:rPr>
                 <w:sz w:val="18"/>
                 <w:szCs w:val="18"/>
@@ -7748,6 +7773,7 @@
             <w:pPr>
               <w:pStyle w:val="Normal"/>
               <w:spacing w:before="40" w:after="40"/>
+              <w:jc w:val="left"/>
               <w:rPr>
                 <w:sz w:val="18"/>
                 <w:szCs w:val="18"/>
@@ -7776,6 +7802,7 @@
             <w:pPr>
               <w:pStyle w:val="Normal"/>
               <w:spacing w:before="40" w:after="40"/>
+              <w:jc w:val="left"/>
               <w:rPr>
                 <w:sz w:val="18"/>
                 <w:szCs w:val="18"/>
@@ -7809,6 +7836,7 @@
             <w:pPr>
               <w:pStyle w:val="Normal"/>
               <w:spacing w:before="40" w:after="40"/>
+              <w:jc w:val="left"/>
               <w:rPr>
                 <w:sz w:val="18"/>
                 <w:szCs w:val="18"/>
@@ -7837,6 +7865,7 @@
             <w:pPr>
               <w:pStyle w:val="Normal"/>
               <w:spacing w:before="40" w:after="40"/>
+              <w:jc w:val="left"/>
               <w:rPr>
                 <w:sz w:val="18"/>
                 <w:szCs w:val="18"/>
@@ -7865,6 +7894,7 @@
             <w:pPr>
               <w:pStyle w:val="Normal"/>
               <w:spacing w:before="40" w:after="40"/>
+              <w:jc w:val="left"/>
               <w:rPr>
                 <w:sz w:val="18"/>
                 <w:szCs w:val="18"/>

</xml_diff>